<commit_message>
Only Change is Test Report
</commit_message>
<xml_diff>
--- a/Test Report.docx
+++ b/Test Report.docx
@@ -309,25 +309,7 @@
           <w:sz w:val="22"/>
           <w:szCs w:val="22"/>
         </w:rPr>
-        <w:t xml:space="preserve">GAMA SECOND </w:t>
-      </w:r>
-      <w:r>
-        <w:rPr>
-          <w:b/>
-          <w:bCs/>
-          <w:sz w:val="22"/>
-          <w:szCs w:val="22"/>
-        </w:rPr>
-        <w:t xml:space="preserve">API </w:t>
-      </w:r>
-      <w:r>
-        <w:rPr>
-          <w:b/>
-          <w:bCs/>
-          <w:sz w:val="22"/>
-          <w:szCs w:val="22"/>
-        </w:rPr>
-        <w:t>TEST</w:t>
+        <w:t>WEEK 4 GATE 4</w:t>
       </w:r>
     </w:p>
     <w:p>
@@ -358,6 +340,12 @@
       </w:r>
     </w:p>
     <w:p>
+      <w:pPr>
+        <w:rPr>
+          <w:sz w:val="22"/>
+          <w:szCs w:val="22"/>
+        </w:rPr>
+      </w:pPr>
       <w:r>
         <w:rPr>
           <w:sz w:val="22"/>
@@ -365,13 +353,70 @@
         </w:rPr>
         <w:t xml:space="preserve">As per the </w:t>
       </w:r>
+      <w:r>
+        <w:rPr>
+          <w:sz w:val="22"/>
+          <w:szCs w:val="22"/>
+        </w:rPr>
+        <w:t>assessment</w:t>
+      </w:r>
+      <w:r>
+        <w:rPr>
+          <w:sz w:val="22"/>
+          <w:szCs w:val="22"/>
+        </w:rPr>
+        <w:t xml:space="preserve"> </w:t>
+      </w:r>
+      <w:r>
+        <w:rPr>
+          <w:sz w:val="22"/>
+          <w:szCs w:val="22"/>
+        </w:rPr>
+        <w:t xml:space="preserve">we need to create producer – consumer contract </w:t>
+      </w:r>
+      <w:proofErr w:type="gramStart"/>
+      <w:r>
+        <w:rPr>
+          <w:sz w:val="22"/>
+          <w:szCs w:val="22"/>
+        </w:rPr>
+        <w:t>And</w:t>
+      </w:r>
+      <w:proofErr w:type="gramEnd"/>
+      <w:r>
+        <w:rPr>
+          <w:sz w:val="22"/>
+          <w:szCs w:val="22"/>
+        </w:rPr>
+        <w:t xml:space="preserve"> simple selenide pom structure test case.</w:t>
+      </w:r>
+    </w:p>
+    <w:p>
+      <w:pPr>
+        <w:pStyle w:val="ListParagraph"/>
+        <w:numPr>
+          <w:ilvl w:val="0"/>
+          <w:numId w:val="1"/>
+        </w:numPr>
+        <w:rPr>
+          <w:sz w:val="22"/>
+          <w:szCs w:val="22"/>
+        </w:rPr>
+      </w:pPr>
+      <w:r>
+        <w:rPr>
+          <w:sz w:val="22"/>
+          <w:szCs w:val="22"/>
+        </w:rPr>
+        <w:t xml:space="preserve">Provider which in a single folder and will run using </w:t>
+      </w:r>
       <w:proofErr w:type="spellStart"/>
       <w:r>
         <w:rPr>
           <w:sz w:val="22"/>
           <w:szCs w:val="22"/>
         </w:rPr>
-        <w:t>assesment</w:t>
+        <w:t>github</w:t>
       </w:r>
       <w:proofErr w:type="spellEnd"/>
       <w:r>
@@ -379,9 +424,3850 @@
           <w:sz w:val="22"/>
           <w:szCs w:val="22"/>
         </w:rPr>
-        <w:t xml:space="preserve"> we need to create </w:t>
-      </w:r>
-    </w:p>
+        <w:t xml:space="preserve"> ci</w:t>
+      </w:r>
+    </w:p>
+    <w:p>
+      <w:pPr>
+        <w:pStyle w:val="ListParagraph"/>
+        <w:numPr>
+          <w:ilvl w:val="0"/>
+          <w:numId w:val="1"/>
+        </w:numPr>
+        <w:rPr>
+          <w:sz w:val="22"/>
+          <w:szCs w:val="22"/>
+        </w:rPr>
+      </w:pPr>
+      <w:r>
+        <w:rPr>
+          <w:sz w:val="22"/>
+          <w:szCs w:val="22"/>
+        </w:rPr>
+        <w:t>Consumer</w:t>
+      </w:r>
+      <w:r>
+        <w:rPr>
+          <w:sz w:val="22"/>
+          <w:szCs w:val="22"/>
+        </w:rPr>
+        <w:t xml:space="preserve"> which in a single folder and will run using </w:t>
+      </w:r>
+      <w:proofErr w:type="spellStart"/>
+      <w:r>
+        <w:rPr>
+          <w:sz w:val="22"/>
+          <w:szCs w:val="22"/>
+        </w:rPr>
+        <w:t>github</w:t>
+      </w:r>
+      <w:proofErr w:type="spellEnd"/>
+      <w:r>
+        <w:rPr>
+          <w:sz w:val="22"/>
+          <w:szCs w:val="22"/>
+        </w:rPr>
+        <w:t xml:space="preserve"> ci</w:t>
+      </w:r>
+    </w:p>
+    <w:p>
+      <w:pPr>
+        <w:pStyle w:val="ListParagraph"/>
+        <w:numPr>
+          <w:ilvl w:val="0"/>
+          <w:numId w:val="1"/>
+        </w:numPr>
+        <w:rPr>
+          <w:sz w:val="22"/>
+          <w:szCs w:val="22"/>
+        </w:rPr>
+      </w:pPr>
+      <w:r>
+        <w:rPr>
+          <w:sz w:val="22"/>
+          <w:szCs w:val="22"/>
+        </w:rPr>
+        <w:t xml:space="preserve">Simple selenide test </w:t>
+      </w:r>
+      <w:proofErr w:type="gramStart"/>
+      <w:r>
+        <w:rPr>
+          <w:sz w:val="22"/>
+          <w:szCs w:val="22"/>
+        </w:rPr>
+        <w:t xml:space="preserve">with </w:t>
+      </w:r>
+      <w:r>
+        <w:rPr>
+          <w:sz w:val="22"/>
+          <w:szCs w:val="22"/>
+        </w:rPr>
+        <w:t xml:space="preserve"> in</w:t>
+      </w:r>
+      <w:proofErr w:type="gramEnd"/>
+      <w:r>
+        <w:rPr>
+          <w:sz w:val="22"/>
+          <w:szCs w:val="22"/>
+        </w:rPr>
+        <w:t xml:space="preserve"> the proper POM structure</w:t>
+      </w:r>
+    </w:p>
+    <w:p>
+      <w:pPr>
+        <w:pBdr>
+          <w:bottom w:val="single" w:sz="6" w:space="1" w:color="auto"/>
+        </w:pBdr>
+        <w:rPr>
+          <w:b/>
+          <w:bCs/>
+          <w:sz w:val="22"/>
+          <w:szCs w:val="22"/>
+        </w:rPr>
+      </w:pPr>
+    </w:p>
+    <w:p>
+      <w:pPr>
+        <w:rPr>
+          <w:b/>
+          <w:bCs/>
+          <w:sz w:val="28"/>
+          <w:szCs w:val="28"/>
+        </w:rPr>
+      </w:pPr>
+      <w:r>
+        <w:rPr>
+          <w:b/>
+          <w:bCs/>
+          <w:sz w:val="28"/>
+          <w:szCs w:val="28"/>
+        </w:rPr>
+        <w:t>Environment and Setup</w:t>
+      </w:r>
+    </w:p>
+    <w:p>
+      <w:pPr>
+        <w:rPr>
+          <w:b/>
+          <w:bCs/>
+          <w:sz w:val="28"/>
+          <w:szCs w:val="28"/>
+        </w:rPr>
+      </w:pPr>
+      <w:r>
+        <w:rPr>
+          <w:b/>
+          <w:bCs/>
+          <w:sz w:val="28"/>
+          <w:szCs w:val="28"/>
+        </w:rPr>
+        <w:t>For Selenide</w:t>
+      </w:r>
+    </w:p>
+    <w:p>
+      <w:pPr>
+        <w:pStyle w:val="ListParagraph"/>
+        <w:numPr>
+          <w:ilvl w:val="0"/>
+          <w:numId w:val="2"/>
+        </w:numPr>
+        <w:rPr>
+          <w:sz w:val="22"/>
+          <w:szCs w:val="22"/>
+        </w:rPr>
+      </w:pPr>
+      <w:r>
+        <w:rPr>
+          <w:sz w:val="22"/>
+          <w:szCs w:val="22"/>
+        </w:rPr>
+        <w:t>Language used - JAVA</w:t>
+      </w:r>
+    </w:p>
+    <w:p>
+      <w:pPr>
+        <w:pStyle w:val="ListParagraph"/>
+        <w:numPr>
+          <w:ilvl w:val="0"/>
+          <w:numId w:val="2"/>
+        </w:numPr>
+        <w:rPr>
+          <w:sz w:val="22"/>
+          <w:szCs w:val="22"/>
+        </w:rPr>
+      </w:pPr>
+      <w:r>
+        <w:rPr>
+          <w:sz w:val="22"/>
+          <w:szCs w:val="22"/>
+        </w:rPr>
+        <w:t>Technology Used – MAVEN</w:t>
+      </w:r>
+    </w:p>
+    <w:p>
+      <w:pPr>
+        <w:pStyle w:val="ListParagraph"/>
+        <w:numPr>
+          <w:ilvl w:val="0"/>
+          <w:numId w:val="2"/>
+        </w:numPr>
+        <w:rPr>
+          <w:sz w:val="22"/>
+          <w:szCs w:val="22"/>
+        </w:rPr>
+      </w:pPr>
+      <w:r>
+        <w:rPr>
+          <w:sz w:val="22"/>
+          <w:szCs w:val="22"/>
+        </w:rPr>
+        <w:t>OS/Browser – Windows / Chrome</w:t>
+      </w:r>
+    </w:p>
+    <w:p>
+      <w:pPr>
+        <w:rPr>
+          <w:b/>
+          <w:bCs/>
+          <w:sz w:val="22"/>
+          <w:szCs w:val="22"/>
+        </w:rPr>
+      </w:pPr>
+      <w:r>
+        <w:rPr>
+          <w:b/>
+          <w:bCs/>
+          <w:sz w:val="22"/>
+          <w:szCs w:val="22"/>
+        </w:rPr>
+        <w:t xml:space="preserve">To </w:t>
+      </w:r>
+      <w:r>
+        <w:rPr>
+          <w:b/>
+          <w:bCs/>
+          <w:sz w:val="22"/>
+          <w:szCs w:val="22"/>
+        </w:rPr>
+        <w:t>setup the c</w:t>
+      </w:r>
+      <w:r>
+        <w:rPr>
+          <w:b/>
+          <w:bCs/>
+          <w:sz w:val="22"/>
+          <w:szCs w:val="22"/>
+        </w:rPr>
+        <w:t>ode:</w:t>
+      </w:r>
+    </w:p>
+    <w:p>
+      <w:pPr>
+        <w:rPr>
+          <w:sz w:val="22"/>
+          <w:szCs w:val="22"/>
+        </w:rPr>
+      </w:pPr>
+      <w:r>
+        <w:rPr>
+          <w:sz w:val="22"/>
+          <w:szCs w:val="22"/>
+        </w:rPr>
+        <w:t>Run this command</w:t>
+      </w:r>
+    </w:p>
+    <w:p>
+      <w:pPr>
+        <w:rPr>
+          <w:sz w:val="22"/>
+          <w:szCs w:val="22"/>
+        </w:rPr>
+      </w:pPr>
+      <w:r>
+        <w:rPr>
+          <w:sz w:val="22"/>
+          <w:szCs w:val="22"/>
+        </w:rPr>
+        <w:t xml:space="preserve">git </w:t>
+      </w:r>
+      <w:r>
+        <w:rPr>
+          <w:sz w:val="22"/>
+          <w:szCs w:val="22"/>
+        </w:rPr>
+        <w:t xml:space="preserve">clone –branch </w:t>
+      </w:r>
+      <w:r>
+        <w:rPr>
+          <w:sz w:val="22"/>
+          <w:szCs w:val="22"/>
+        </w:rPr>
+        <w:t>muhammed-week04-gate4</w:t>
+      </w:r>
+      <w:r>
+        <w:rPr>
+          <w:sz w:val="22"/>
+          <w:szCs w:val="22"/>
+        </w:rPr>
+        <w:t xml:space="preserve"> </w:t>
+      </w:r>
+      <w:r>
+        <w:rPr>
+          <w:sz w:val="22"/>
+          <w:szCs w:val="22"/>
+        </w:rPr>
+        <w:t xml:space="preserve">--single-branch </w:t>
+      </w:r>
+      <w:hyperlink r:id="rId5" w:history="1">
+        <w:r>
+          <w:rPr>
+            <w:rStyle w:val="Hyperlink"/>
+            <w:sz w:val="22"/>
+            <w:szCs w:val="22"/>
+          </w:rPr>
+          <w:t>https://github.com/ust-sdet-training/SDET</w:t>
+        </w:r>
+      </w:hyperlink>
+    </w:p>
+    <w:p>
+      <w:pPr>
+        <w:rPr>
+          <w:sz w:val="22"/>
+          <w:szCs w:val="22"/>
+        </w:rPr>
+      </w:pPr>
+      <w:r>
+        <w:rPr>
+          <w:sz w:val="22"/>
+          <w:szCs w:val="22"/>
+        </w:rPr>
+        <w:t xml:space="preserve">or </w:t>
+      </w:r>
+    </w:p>
+    <w:p>
+      <w:pPr>
+        <w:rPr>
+          <w:sz w:val="22"/>
+          <w:szCs w:val="22"/>
+        </w:rPr>
+      </w:pPr>
+      <w:r>
+        <w:rPr>
+          <w:sz w:val="22"/>
+          <w:szCs w:val="22"/>
+        </w:rPr>
+        <w:t xml:space="preserve">clone the </w:t>
+      </w:r>
+      <w:proofErr w:type="gramStart"/>
+      <w:r>
+        <w:rPr>
+          <w:sz w:val="22"/>
+          <w:szCs w:val="22"/>
+        </w:rPr>
+        <w:t>repo :</w:t>
+      </w:r>
+      <w:proofErr w:type="gramEnd"/>
+      <w:r>
+        <w:rPr>
+          <w:sz w:val="22"/>
+          <w:szCs w:val="22"/>
+        </w:rPr>
+        <w:t xml:space="preserve"> </w:t>
+      </w:r>
+      <w:hyperlink r:id="rId6" w:history="1">
+        <w:r>
+          <w:rPr>
+            <w:rStyle w:val="Hyperlink"/>
+            <w:sz w:val="22"/>
+            <w:szCs w:val="22"/>
+          </w:rPr>
+          <w:t>https://github.com/ust-sdet-training/SDET</w:t>
+        </w:r>
+      </w:hyperlink>
+    </w:p>
+    <w:p>
+      <w:pPr>
+        <w:rPr>
+          <w:sz w:val="22"/>
+          <w:szCs w:val="22"/>
+        </w:rPr>
+      </w:pPr>
+      <w:r>
+        <w:rPr>
+          <w:sz w:val="22"/>
+          <w:szCs w:val="22"/>
+        </w:rPr>
+        <w:t xml:space="preserve">go to the branch: </w:t>
+      </w:r>
+      <w:r>
+        <w:rPr>
+          <w:sz w:val="22"/>
+          <w:szCs w:val="22"/>
+        </w:rPr>
+        <w:t>muhammed-week04-gate4</w:t>
+      </w:r>
+    </w:p>
+    <w:p>
+      <w:pPr>
+        <w:rPr>
+          <w:sz w:val="22"/>
+          <w:szCs w:val="22"/>
+        </w:rPr>
+      </w:pPr>
+    </w:p>
+    <w:p>
+      <w:pPr>
+        <w:rPr>
+          <w:sz w:val="22"/>
+          <w:szCs w:val="22"/>
+        </w:rPr>
+      </w:pPr>
+      <w:r>
+        <w:rPr>
+          <w:sz w:val="22"/>
+          <w:szCs w:val="22"/>
+        </w:rPr>
+        <w:t>after cloning</w:t>
+      </w:r>
+    </w:p>
+    <w:p>
+      <w:pPr>
+        <w:rPr>
+          <w:sz w:val="22"/>
+          <w:szCs w:val="22"/>
+        </w:rPr>
+      </w:pPr>
+      <w:r>
+        <w:rPr>
+          <w:sz w:val="22"/>
+          <w:szCs w:val="22"/>
+        </w:rPr>
+        <w:lastRenderedPageBreak/>
+        <w:t>go to the directory /</w:t>
+      </w:r>
+      <w:r>
+        <w:t xml:space="preserve"> </w:t>
+      </w:r>
+      <w:r>
+        <w:rPr>
+          <w:sz w:val="22"/>
+          <w:szCs w:val="22"/>
+        </w:rPr>
+        <w:t>week4selenide</w:t>
+      </w:r>
+      <w:r>
+        <w:rPr>
+          <w:sz w:val="22"/>
+          <w:szCs w:val="22"/>
+        </w:rPr>
+        <w:t xml:space="preserve"> or run the command cd /</w:t>
+      </w:r>
+      <w:r>
+        <w:t xml:space="preserve"> </w:t>
+      </w:r>
+      <w:r>
+        <w:rPr>
+          <w:sz w:val="22"/>
+          <w:szCs w:val="22"/>
+        </w:rPr>
+        <w:t>week4selenide</w:t>
+      </w:r>
+    </w:p>
+    <w:p>
+      <w:pPr>
+        <w:rPr>
+          <w:sz w:val="22"/>
+          <w:szCs w:val="22"/>
+        </w:rPr>
+      </w:pPr>
+    </w:p>
+    <w:p>
+      <w:pPr>
+        <w:rPr>
+          <w:sz w:val="22"/>
+          <w:szCs w:val="22"/>
+        </w:rPr>
+      </w:pPr>
+      <w:r>
+        <w:rPr>
+          <w:sz w:val="22"/>
+          <w:szCs w:val="22"/>
+        </w:rPr>
+        <w:t>then run the command</w:t>
+      </w:r>
+    </w:p>
+    <w:p>
+      <w:pPr>
+        <w:rPr>
+          <w:sz w:val="22"/>
+          <w:szCs w:val="22"/>
+        </w:rPr>
+      </w:pPr>
+      <w:r>
+        <w:rPr>
+          <w:sz w:val="22"/>
+          <w:szCs w:val="22"/>
+        </w:rPr>
+        <w:t>maven clean install</w:t>
+      </w:r>
+    </w:p>
+    <w:p>
+      <w:pPr>
+        <w:rPr>
+          <w:sz w:val="22"/>
+          <w:szCs w:val="22"/>
+        </w:rPr>
+      </w:pPr>
+      <w:proofErr w:type="gramStart"/>
+      <w:r>
+        <w:rPr>
+          <w:sz w:val="22"/>
+          <w:szCs w:val="22"/>
+        </w:rPr>
+        <w:t>in order to</w:t>
+      </w:r>
+      <w:proofErr w:type="gramEnd"/>
+      <w:r>
+        <w:rPr>
+          <w:sz w:val="22"/>
+          <w:szCs w:val="22"/>
+        </w:rPr>
+        <w:t xml:space="preserve"> download the dependencies</w:t>
+      </w:r>
+    </w:p>
+    <w:p>
+      <w:pPr>
+        <w:rPr>
+          <w:sz w:val="22"/>
+          <w:szCs w:val="22"/>
+        </w:rPr>
+      </w:pPr>
+    </w:p>
+    <w:p>
+      <w:pPr>
+        <w:rPr>
+          <w:b/>
+          <w:bCs/>
+          <w:sz w:val="22"/>
+          <w:szCs w:val="22"/>
+        </w:rPr>
+      </w:pPr>
+      <w:r>
+        <w:rPr>
+          <w:b/>
+          <w:bCs/>
+          <w:sz w:val="22"/>
+          <w:szCs w:val="22"/>
+        </w:rPr>
+        <w:t>URL Configuration</w:t>
+      </w:r>
+      <w:r>
+        <w:rPr>
+          <w:b/>
+          <w:bCs/>
+          <w:sz w:val="22"/>
+          <w:szCs w:val="22"/>
+        </w:rPr>
+        <w:t>:</w:t>
+      </w:r>
+    </w:p>
+    <w:p>
+      <w:pPr>
+        <w:rPr>
+          <w:sz w:val="22"/>
+          <w:szCs w:val="22"/>
+        </w:rPr>
+      </w:pPr>
+      <w:r>
+        <w:rPr>
+          <w:sz w:val="22"/>
+          <w:szCs w:val="22"/>
+        </w:rPr>
+        <w:t xml:space="preserve">public static String </w:t>
+      </w:r>
+      <w:proofErr w:type="spellStart"/>
+      <w:proofErr w:type="gramStart"/>
+      <w:r>
+        <w:rPr>
+          <w:sz w:val="22"/>
+          <w:szCs w:val="22"/>
+        </w:rPr>
+        <w:t>baseUrl</w:t>
+      </w:r>
+      <w:proofErr w:type="spellEnd"/>
+      <w:r>
+        <w:rPr>
+          <w:sz w:val="22"/>
+          <w:szCs w:val="22"/>
+        </w:rPr>
+        <w:t>(){</w:t>
+      </w:r>
+      <w:proofErr w:type="gramEnd"/>
+    </w:p>
+    <w:p>
+      <w:pPr>
+        <w:rPr>
+          <w:sz w:val="22"/>
+          <w:szCs w:val="22"/>
+        </w:rPr>
+      </w:pPr>
+      <w:r>
+        <w:rPr>
+          <w:sz w:val="22"/>
+          <w:szCs w:val="22"/>
+        </w:rPr>
+        <w:t>        return TestEnvironment.optional("baseUrl","http://localhost:5173/").replaceAll("/$", "");</w:t>
+      </w:r>
+    </w:p>
+    <w:p>
+      <w:pPr>
+        <w:rPr>
+          <w:sz w:val="22"/>
+          <w:szCs w:val="22"/>
+        </w:rPr>
+      </w:pPr>
+      <w:r>
+        <w:rPr>
+          <w:sz w:val="22"/>
+          <w:szCs w:val="22"/>
+        </w:rPr>
+        <w:t>    }</w:t>
+      </w:r>
+    </w:p>
+    <w:p>
+      <w:pPr>
+        <w:rPr>
+          <w:sz w:val="22"/>
+          <w:szCs w:val="22"/>
+        </w:rPr>
+      </w:pPr>
+      <w:r>
+        <w:rPr>
+          <w:sz w:val="22"/>
+          <w:szCs w:val="22"/>
+        </w:rPr>
+        <w:t>in the support/config</w:t>
+      </w:r>
+    </w:p>
+    <w:p>
+      <w:pPr>
+        <w:pBdr>
+          <w:bottom w:val="single" w:sz="6" w:space="1" w:color="auto"/>
+        </w:pBdr>
+        <w:spacing w:after="120"/>
+        <w:rPr>
+          <w:sz w:val="22"/>
+          <w:szCs w:val="22"/>
+        </w:rPr>
+      </w:pPr>
+      <w:r>
+        <w:rPr>
+          <w:b/>
+          <w:bCs/>
+          <w:sz w:val="22"/>
+          <w:szCs w:val="22"/>
+        </w:rPr>
+        <w:t xml:space="preserve">You can pass through env </w:t>
+      </w:r>
+      <w:proofErr w:type="gramStart"/>
+      <w:r>
+        <w:rPr>
+          <w:b/>
+          <w:bCs/>
+          <w:sz w:val="22"/>
+          <w:szCs w:val="22"/>
+        </w:rPr>
+        <w:t>too</w:t>
+      </w:r>
+      <w:r>
+        <w:rPr>
+          <w:b/>
+          <w:bCs/>
+          <w:sz w:val="22"/>
+          <w:szCs w:val="22"/>
+        </w:rPr>
+        <w:t xml:space="preserve"> :</w:t>
+      </w:r>
+      <w:proofErr w:type="gramEnd"/>
+      <w:r>
+        <w:rPr>
+          <w:sz w:val="22"/>
+          <w:szCs w:val="22"/>
+        </w:rPr>
+        <w:t xml:space="preserve"> In the </w:t>
+      </w:r>
+      <w:proofErr w:type="spellStart"/>
+      <w:r>
+        <w:rPr>
+          <w:sz w:val="22"/>
+          <w:szCs w:val="22"/>
+        </w:rPr>
+        <w:t>the</w:t>
+      </w:r>
+      <w:proofErr w:type="spellEnd"/>
+      <w:r>
+        <w:rPr>
+          <w:sz w:val="22"/>
+          <w:szCs w:val="22"/>
+        </w:rPr>
+        <w:t xml:space="preserve"> </w:t>
+      </w:r>
+      <w:r>
+        <w:rPr>
+          <w:sz w:val="22"/>
+          <w:szCs w:val="22"/>
+        </w:rPr>
+        <w:t>week4selenide</w:t>
+      </w:r>
+      <w:r>
+        <w:rPr>
+          <w:sz w:val="22"/>
+          <w:szCs w:val="22"/>
+        </w:rPr>
+        <w:t xml:space="preserve"> root file create .env file and add the </w:t>
+      </w:r>
+      <w:proofErr w:type="spellStart"/>
+      <w:r>
+        <w:rPr>
+          <w:sz w:val="22"/>
+          <w:szCs w:val="22"/>
+        </w:rPr>
+        <w:t>url</w:t>
+      </w:r>
+      <w:proofErr w:type="spellEnd"/>
+      <w:r>
+        <w:rPr>
+          <w:sz w:val="22"/>
+          <w:szCs w:val="22"/>
+        </w:rPr>
+        <w:t xml:space="preserve"> like </w:t>
+      </w:r>
+      <w:proofErr w:type="gramStart"/>
+      <w:r>
+        <w:rPr>
+          <w:sz w:val="22"/>
+          <w:szCs w:val="22"/>
+        </w:rPr>
+        <w:t xml:space="preserve">this  </w:t>
+      </w:r>
+      <w:proofErr w:type="spellStart"/>
+      <w:r>
+        <w:rPr>
+          <w:sz w:val="22"/>
+          <w:szCs w:val="22"/>
+        </w:rPr>
+        <w:t>baseUrl</w:t>
+      </w:r>
+      <w:proofErr w:type="spellEnd"/>
+      <w:proofErr w:type="gramEnd"/>
+      <w:r>
+        <w:rPr>
+          <w:sz w:val="22"/>
+          <w:szCs w:val="22"/>
+        </w:rPr>
+        <w:t>=YOURFRONTENDURL</w:t>
+      </w:r>
+    </w:p>
+    <w:p>
+      <w:pPr>
+        <w:pBdr>
+          <w:bottom w:val="single" w:sz="6" w:space="1" w:color="auto"/>
+        </w:pBdr>
+        <w:spacing w:after="120"/>
+        <w:rPr>
+          <w:sz w:val="22"/>
+          <w:szCs w:val="22"/>
+        </w:rPr>
+      </w:pPr>
+    </w:p>
+    <w:p>
+      <w:pPr>
+        <w:rPr>
+          <w:b/>
+          <w:bCs/>
+          <w:sz w:val="28"/>
+          <w:szCs w:val="28"/>
+        </w:rPr>
+      </w:pPr>
+      <w:r>
+        <w:rPr>
+          <w:b/>
+          <w:bCs/>
+          <w:sz w:val="28"/>
+          <w:szCs w:val="28"/>
+        </w:rPr>
+        <w:t xml:space="preserve">For </w:t>
+      </w:r>
+      <w:r>
+        <w:rPr>
+          <w:b/>
+          <w:bCs/>
+          <w:sz w:val="28"/>
+          <w:szCs w:val="28"/>
+        </w:rPr>
+        <w:t>Pact</w:t>
+      </w:r>
+    </w:p>
+    <w:p>
+      <w:pPr>
+        <w:pStyle w:val="ListParagraph"/>
+        <w:numPr>
+          <w:ilvl w:val="0"/>
+          <w:numId w:val="6"/>
+        </w:numPr>
+        <w:rPr>
+          <w:sz w:val="22"/>
+          <w:szCs w:val="22"/>
+        </w:rPr>
+      </w:pPr>
+      <w:r>
+        <w:rPr>
+          <w:sz w:val="22"/>
+          <w:szCs w:val="22"/>
+        </w:rPr>
+        <w:t>Language used - JAVA</w:t>
+      </w:r>
+    </w:p>
+    <w:p>
+      <w:pPr>
+        <w:pStyle w:val="ListParagraph"/>
+        <w:numPr>
+          <w:ilvl w:val="0"/>
+          <w:numId w:val="6"/>
+        </w:numPr>
+        <w:rPr>
+          <w:sz w:val="22"/>
+          <w:szCs w:val="22"/>
+        </w:rPr>
+      </w:pPr>
+      <w:r>
+        <w:rPr>
+          <w:sz w:val="22"/>
+          <w:szCs w:val="22"/>
+        </w:rPr>
+        <w:t>Technology Used – MAVEN</w:t>
+      </w:r>
+    </w:p>
+    <w:p>
+      <w:pPr>
+        <w:rPr>
+          <w:b/>
+          <w:bCs/>
+          <w:sz w:val="22"/>
+          <w:szCs w:val="22"/>
+        </w:rPr>
+      </w:pPr>
+      <w:r>
+        <w:rPr>
+          <w:b/>
+          <w:bCs/>
+          <w:sz w:val="22"/>
+          <w:szCs w:val="22"/>
+        </w:rPr>
+        <w:t xml:space="preserve">To </w:t>
+      </w:r>
+      <w:r>
+        <w:rPr>
+          <w:b/>
+          <w:bCs/>
+          <w:sz w:val="22"/>
+          <w:szCs w:val="22"/>
+        </w:rPr>
+        <w:t>setup the c</w:t>
+      </w:r>
+      <w:r>
+        <w:rPr>
+          <w:b/>
+          <w:bCs/>
+          <w:sz w:val="22"/>
+          <w:szCs w:val="22"/>
+        </w:rPr>
+        <w:t>ode:</w:t>
+      </w:r>
+    </w:p>
+    <w:p>
+      <w:pPr>
+        <w:rPr>
+          <w:sz w:val="22"/>
+          <w:szCs w:val="22"/>
+        </w:rPr>
+      </w:pPr>
+      <w:r>
+        <w:rPr>
+          <w:sz w:val="22"/>
+          <w:szCs w:val="22"/>
+        </w:rPr>
+        <w:t>Run this command</w:t>
+      </w:r>
+    </w:p>
+    <w:p>
+      <w:pPr>
+        <w:rPr>
+          <w:sz w:val="22"/>
+          <w:szCs w:val="22"/>
+        </w:rPr>
+      </w:pPr>
+      <w:r>
+        <w:rPr>
+          <w:sz w:val="22"/>
+          <w:szCs w:val="22"/>
+        </w:rPr>
+        <w:t xml:space="preserve">To run it in the ci just go to the repo </w:t>
+      </w:r>
+      <w:hyperlink r:id="rId7" w:history="1">
+        <w:r>
+          <w:rPr>
+            <w:rStyle w:val="Hyperlink"/>
+            <w:sz w:val="22"/>
+            <w:szCs w:val="22"/>
+          </w:rPr>
+          <w:t>https://github.com/ust-sdet-training/SDET</w:t>
+        </w:r>
+      </w:hyperlink>
+    </w:p>
+    <w:p>
+      <w:pPr>
+        <w:rPr>
+          <w:sz w:val="22"/>
+          <w:szCs w:val="22"/>
+        </w:rPr>
+      </w:pPr>
+      <w:r>
+        <w:rPr>
+          <w:sz w:val="22"/>
+          <w:szCs w:val="22"/>
+        </w:rPr>
+        <w:t xml:space="preserve">and go to </w:t>
+      </w:r>
+      <w:proofErr w:type="spellStart"/>
+      <w:r>
+        <w:rPr>
+          <w:sz w:val="22"/>
+          <w:szCs w:val="22"/>
+        </w:rPr>
+        <w:t>acution</w:t>
+      </w:r>
+      <w:proofErr w:type="spellEnd"/>
+      <w:r>
+        <w:rPr>
+          <w:sz w:val="22"/>
+          <w:szCs w:val="22"/>
+        </w:rPr>
+        <w:t xml:space="preserve"> and in filer use the </w:t>
+      </w:r>
+      <w:proofErr w:type="gramStart"/>
+      <w:r>
+        <w:rPr>
+          <w:sz w:val="22"/>
+          <w:szCs w:val="22"/>
+        </w:rPr>
+        <w:t>branch :</w:t>
+      </w:r>
+      <w:proofErr w:type="gramEnd"/>
+      <w:r>
+        <w:rPr>
+          <w:sz w:val="22"/>
+          <w:szCs w:val="22"/>
+        </w:rPr>
+        <w:t xml:space="preserve"> </w:t>
+      </w:r>
+      <w:r>
+        <w:rPr>
+          <w:sz w:val="22"/>
+          <w:szCs w:val="22"/>
+        </w:rPr>
+        <w:t>muhammed-week04-gate4</w:t>
+      </w:r>
+      <w:r>
+        <w:rPr>
+          <w:sz w:val="22"/>
+          <w:szCs w:val="22"/>
+        </w:rPr>
+        <w:t xml:space="preserve"> and you can see two action one is provider and another one is consumer. You can just run the </w:t>
+      </w:r>
+      <w:r>
+        <w:rPr>
+          <w:sz w:val="22"/>
+          <w:szCs w:val="22"/>
+        </w:rPr>
+        <w:t>actions or</w:t>
+      </w:r>
+      <w:r>
+        <w:rPr>
+          <w:sz w:val="22"/>
+          <w:szCs w:val="22"/>
+        </w:rPr>
+        <w:t xml:space="preserve"> </w:t>
+      </w:r>
+      <w:r>
+        <w:rPr>
+          <w:sz w:val="22"/>
+          <w:szCs w:val="22"/>
+        </w:rPr>
+        <w:t>push or have pull request.</w:t>
+      </w:r>
+    </w:p>
+    <w:p>
+      <w:pPr>
+        <w:rPr>
+          <w:sz w:val="22"/>
+          <w:szCs w:val="22"/>
+        </w:rPr>
+      </w:pPr>
+    </w:p>
+    <w:p>
+      <w:pPr>
+        <w:rPr>
+          <w:b/>
+          <w:bCs/>
+          <w:sz w:val="22"/>
+          <w:szCs w:val="22"/>
+        </w:rPr>
+      </w:pPr>
+      <w:r>
+        <w:rPr>
+          <w:b/>
+          <w:bCs/>
+          <w:sz w:val="22"/>
+          <w:szCs w:val="22"/>
+        </w:rPr>
+        <w:t>URL</w:t>
+      </w:r>
+      <w:r>
+        <w:rPr>
+          <w:b/>
+          <w:bCs/>
+          <w:sz w:val="22"/>
+          <w:szCs w:val="22"/>
+        </w:rPr>
+        <w:t xml:space="preserve"> and token</w:t>
+      </w:r>
+      <w:r>
+        <w:rPr>
+          <w:b/>
+          <w:bCs/>
+          <w:sz w:val="22"/>
+          <w:szCs w:val="22"/>
+        </w:rPr>
+        <w:t xml:space="preserve"> Configuration</w:t>
+      </w:r>
+      <w:r>
+        <w:rPr>
+          <w:b/>
+          <w:bCs/>
+          <w:sz w:val="22"/>
+          <w:szCs w:val="22"/>
+        </w:rPr>
+        <w:t>:</w:t>
+      </w:r>
+    </w:p>
+    <w:p>
+      <w:pPr>
+        <w:rPr>
+          <w:sz w:val="22"/>
+          <w:szCs w:val="22"/>
+        </w:rPr>
+      </w:pPr>
+      <w:r>
+        <w:rPr>
+          <w:sz w:val="22"/>
+          <w:szCs w:val="22"/>
+        </w:rPr>
+        <w:t xml:space="preserve">Only broker is the live docker using the </w:t>
+      </w:r>
+      <w:proofErr w:type="spellStart"/>
+      <w:r>
+        <w:rPr>
+          <w:sz w:val="22"/>
+          <w:szCs w:val="22"/>
+        </w:rPr>
+        <w:t>pactflow</w:t>
+      </w:r>
+      <w:proofErr w:type="spellEnd"/>
+      <w:r>
+        <w:rPr>
+          <w:sz w:val="22"/>
+          <w:szCs w:val="22"/>
+        </w:rPr>
+        <w:t xml:space="preserve"> website currently I have hardcoded the credentials in the </w:t>
+      </w:r>
+      <w:proofErr w:type="spellStart"/>
+      <w:r>
+        <w:rPr>
+          <w:sz w:val="22"/>
+          <w:szCs w:val="22"/>
+        </w:rPr>
+        <w:t>producer.yml</w:t>
+      </w:r>
+      <w:proofErr w:type="spellEnd"/>
+      <w:r>
+        <w:rPr>
+          <w:sz w:val="22"/>
+          <w:szCs w:val="22"/>
+        </w:rPr>
+        <w:t xml:space="preserve"> and </w:t>
+      </w:r>
+      <w:proofErr w:type="spellStart"/>
+      <w:r>
+        <w:rPr>
+          <w:sz w:val="22"/>
+          <w:szCs w:val="22"/>
+        </w:rPr>
+        <w:t>consumer.yml</w:t>
+      </w:r>
+      <w:proofErr w:type="spellEnd"/>
+      <w:r>
+        <w:rPr>
+          <w:sz w:val="22"/>
+          <w:szCs w:val="22"/>
+        </w:rPr>
+        <w:t xml:space="preserve"> using the </w:t>
+      </w:r>
+      <w:proofErr w:type="spellStart"/>
+      <w:r>
+        <w:rPr>
+          <w:sz w:val="22"/>
+          <w:szCs w:val="22"/>
+        </w:rPr>
+        <w:t>github</w:t>
+      </w:r>
+      <w:proofErr w:type="spellEnd"/>
+      <w:r>
+        <w:rPr>
+          <w:sz w:val="22"/>
+          <w:szCs w:val="22"/>
+        </w:rPr>
+        <w:t xml:space="preserve"> secretes also can modify the credentials for that first we need to change the </w:t>
+      </w:r>
+    </w:p>
+    <w:p>
+      <w:pPr>
+        <w:rPr>
+          <w:sz w:val="22"/>
+          <w:szCs w:val="22"/>
+        </w:rPr>
+      </w:pPr>
+      <w:r>
+        <w:rPr>
+          <w:sz w:val="22"/>
+          <w:szCs w:val="22"/>
+        </w:rPr>
+        <w:t>--broker-base-</w:t>
+      </w:r>
+      <w:proofErr w:type="spellStart"/>
+      <w:r>
+        <w:rPr>
+          <w:sz w:val="22"/>
+          <w:szCs w:val="22"/>
+        </w:rPr>
+        <w:t>url</w:t>
+      </w:r>
+      <w:proofErr w:type="spellEnd"/>
+      <w:r>
+        <w:rPr>
+          <w:sz w:val="22"/>
+          <w:szCs w:val="22"/>
+        </w:rPr>
+        <w:t>=</w:t>
+      </w:r>
+      <w:r>
+        <w:rPr>
+          <w:sz w:val="22"/>
+          <w:szCs w:val="22"/>
+        </w:rPr>
+        <w:t>{{</w:t>
+      </w:r>
+      <w:proofErr w:type="spellStart"/>
+      <w:proofErr w:type="gramStart"/>
+      <w:r>
+        <w:rPr>
+          <w:sz w:val="22"/>
+          <w:szCs w:val="22"/>
+        </w:rPr>
+        <w:t>secrets.SECRETEURLURL</w:t>
+      </w:r>
+      <w:proofErr w:type="spellEnd"/>
+      <w:proofErr w:type="gramEnd"/>
+      <w:r>
+        <w:rPr>
+          <w:sz w:val="22"/>
+          <w:szCs w:val="22"/>
+        </w:rPr>
+        <w:t>}}</w:t>
+      </w:r>
+      <w:r>
+        <w:rPr>
+          <w:sz w:val="22"/>
+          <w:szCs w:val="22"/>
+        </w:rPr>
+        <w:t xml:space="preserve"> </w:t>
+      </w:r>
+    </w:p>
+    <w:p>
+      <w:pPr>
+        <w:rPr>
+          <w:sz w:val="22"/>
+          <w:szCs w:val="22"/>
+        </w:rPr>
+      </w:pPr>
+      <w:r>
+        <w:rPr>
+          <w:sz w:val="22"/>
+          <w:szCs w:val="22"/>
+        </w:rPr>
+        <w:t>--broker-token=</w:t>
+      </w:r>
+      <w:r>
+        <w:rPr>
+          <w:sz w:val="22"/>
+          <w:szCs w:val="22"/>
+        </w:rPr>
+        <w:t>{{</w:t>
+      </w:r>
+      <w:proofErr w:type="spellStart"/>
+      <w:proofErr w:type="gramStart"/>
+      <w:r>
+        <w:rPr>
+          <w:sz w:val="22"/>
+          <w:szCs w:val="22"/>
+        </w:rPr>
+        <w:t>secrets.SECRETEURL</w:t>
+      </w:r>
+      <w:r>
+        <w:rPr>
+          <w:sz w:val="22"/>
+          <w:szCs w:val="22"/>
+        </w:rPr>
+        <w:t>TOKEN</w:t>
+      </w:r>
+      <w:proofErr w:type="spellEnd"/>
+      <w:proofErr w:type="gramEnd"/>
+      <w:r>
+        <w:rPr>
+          <w:sz w:val="22"/>
+          <w:szCs w:val="22"/>
+        </w:rPr>
+        <w:t>}}</w:t>
+      </w:r>
+    </w:p>
+    <w:p>
+      <w:pPr>
+        <w:rPr>
+          <w:sz w:val="22"/>
+          <w:szCs w:val="22"/>
+        </w:rPr>
+      </w:pPr>
+      <w:r>
+        <w:rPr>
+          <w:sz w:val="22"/>
+          <w:szCs w:val="22"/>
+        </w:rPr>
+        <w:t> -Dpact.broker.url=</w:t>
+      </w:r>
+      <w:r>
+        <w:rPr>
+          <w:sz w:val="22"/>
+          <w:szCs w:val="22"/>
+        </w:rPr>
+        <w:t>{</w:t>
+      </w:r>
+      <w:proofErr w:type="spellStart"/>
+      <w:proofErr w:type="gramStart"/>
+      <w:r>
+        <w:rPr>
+          <w:sz w:val="22"/>
+          <w:szCs w:val="22"/>
+        </w:rPr>
+        <w:t>secrets.SECRETEURLURL</w:t>
+      </w:r>
+      <w:proofErr w:type="spellEnd"/>
+      <w:proofErr w:type="gramEnd"/>
+      <w:r>
+        <w:rPr>
+          <w:sz w:val="22"/>
+          <w:szCs w:val="22"/>
+        </w:rPr>
+        <w:t>}}</w:t>
+      </w:r>
+      <w:r>
+        <w:rPr>
+          <w:sz w:val="22"/>
+          <w:szCs w:val="22"/>
+        </w:rPr>
+        <w:t xml:space="preserve"> </w:t>
+      </w:r>
+    </w:p>
+    <w:p>
+      <w:pPr>
+        <w:rPr>
+          <w:sz w:val="22"/>
+          <w:szCs w:val="22"/>
+        </w:rPr>
+      </w:pPr>
+      <w:r>
+        <w:rPr>
+          <w:sz w:val="22"/>
+          <w:szCs w:val="22"/>
+        </w:rPr>
+        <w:t> -</w:t>
+      </w:r>
+      <w:proofErr w:type="spellStart"/>
+      <w:proofErr w:type="gramStart"/>
+      <w:r>
+        <w:rPr>
+          <w:sz w:val="22"/>
+          <w:szCs w:val="22"/>
+        </w:rPr>
+        <w:t>Dpact.broker.token</w:t>
+      </w:r>
+      <w:proofErr w:type="spellEnd"/>
+      <w:proofErr w:type="gramEnd"/>
+      <w:r>
+        <w:rPr>
+          <w:sz w:val="22"/>
+          <w:szCs w:val="22"/>
+        </w:rPr>
+        <w:t>=</w:t>
+      </w:r>
+      <w:r>
+        <w:rPr>
+          <w:sz w:val="22"/>
+          <w:szCs w:val="22"/>
+        </w:rPr>
+        <w:t>{{</w:t>
+      </w:r>
+      <w:proofErr w:type="spellStart"/>
+      <w:proofErr w:type="gramStart"/>
+      <w:r>
+        <w:rPr>
+          <w:sz w:val="22"/>
+          <w:szCs w:val="22"/>
+        </w:rPr>
+        <w:t>secrets.SECRETEURLTOKEN</w:t>
+      </w:r>
+      <w:proofErr w:type="spellEnd"/>
+      <w:proofErr w:type="gramEnd"/>
+      <w:r>
+        <w:rPr>
+          <w:sz w:val="22"/>
+          <w:szCs w:val="22"/>
+        </w:rPr>
+        <w:t>}}</w:t>
+      </w:r>
+    </w:p>
+    <w:p>
+      <w:pPr>
+        <w:rPr>
+          <w:sz w:val="22"/>
+          <w:szCs w:val="22"/>
+        </w:rPr>
+      </w:pPr>
+      <w:r>
+        <w:rPr>
+          <w:sz w:val="22"/>
+          <w:szCs w:val="22"/>
+        </w:rPr>
+        <w:lastRenderedPageBreak/>
+        <w:t xml:space="preserve">Replace the </w:t>
+      </w:r>
+      <w:proofErr w:type="spellStart"/>
+      <w:r>
+        <w:rPr>
+          <w:sz w:val="22"/>
+          <w:szCs w:val="22"/>
+        </w:rPr>
+        <w:t>initialsiation</w:t>
+      </w:r>
+      <w:proofErr w:type="spellEnd"/>
+      <w:r>
+        <w:rPr>
+          <w:sz w:val="22"/>
+          <w:szCs w:val="22"/>
+        </w:rPr>
+        <w:t xml:space="preserve"> of these files in </w:t>
+      </w:r>
+      <w:proofErr w:type="gramStart"/>
+      <w:r>
+        <w:rPr>
+          <w:sz w:val="22"/>
+          <w:szCs w:val="22"/>
+        </w:rPr>
+        <w:t>the both</w:t>
+      </w:r>
+      <w:proofErr w:type="gramEnd"/>
+      <w:r>
+        <w:rPr>
+          <w:sz w:val="22"/>
+          <w:szCs w:val="22"/>
+        </w:rPr>
+        <w:t xml:space="preserve"> </w:t>
+      </w:r>
+      <w:proofErr w:type="spellStart"/>
+      <w:r>
+        <w:rPr>
+          <w:sz w:val="22"/>
+          <w:szCs w:val="22"/>
+        </w:rPr>
+        <w:t>yml</w:t>
+      </w:r>
+      <w:proofErr w:type="spellEnd"/>
+      <w:r>
+        <w:rPr>
+          <w:sz w:val="22"/>
+          <w:szCs w:val="22"/>
+        </w:rPr>
+        <w:t xml:space="preserve"> file then go to the repository I have mentioned in the </w:t>
+      </w:r>
+    </w:p>
+    <w:p>
+      <w:pPr>
+        <w:rPr>
+          <w:sz w:val="22"/>
+          <w:szCs w:val="22"/>
+        </w:rPr>
+      </w:pPr>
+      <w:r>
+        <w:rPr>
+          <w:sz w:val="22"/>
+          <w:szCs w:val="22"/>
+        </w:rPr>
+        <w:t xml:space="preserve">repository setting -&gt; </w:t>
+      </w:r>
+      <w:proofErr w:type="spellStart"/>
+      <w:r>
+        <w:rPr>
+          <w:sz w:val="22"/>
+          <w:szCs w:val="22"/>
+        </w:rPr>
+        <w:t>Sceretes</w:t>
+      </w:r>
+      <w:proofErr w:type="spellEnd"/>
+      <w:r>
+        <w:rPr>
+          <w:sz w:val="22"/>
+          <w:szCs w:val="22"/>
+        </w:rPr>
+        <w:t xml:space="preserve"> and variable -&gt; actions -&gt; create new repository secrets name the folder as PACT then add the </w:t>
+      </w:r>
+      <w:proofErr w:type="spellStart"/>
+      <w:r>
+        <w:rPr>
+          <w:sz w:val="22"/>
+          <w:szCs w:val="22"/>
+        </w:rPr>
+        <w:t>url</w:t>
+      </w:r>
+      <w:proofErr w:type="spellEnd"/>
+      <w:r>
+        <w:rPr>
+          <w:sz w:val="22"/>
+          <w:szCs w:val="22"/>
+        </w:rPr>
+        <w:t xml:space="preserve"> and token.</w:t>
+      </w:r>
+    </w:p>
+    <w:p>
+      <w:pPr>
+        <w:pBdr>
+          <w:bottom w:val="single" w:sz="6" w:space="1" w:color="auto"/>
+        </w:pBdr>
+        <w:spacing w:after="120"/>
+        <w:rPr>
+          <w:sz w:val="22"/>
+          <w:szCs w:val="22"/>
+        </w:rPr>
+      </w:pPr>
+      <w:r>
+        <w:rPr>
+          <w:b/>
+          <w:bCs/>
+          <w:sz w:val="22"/>
+          <w:szCs w:val="22"/>
+        </w:rPr>
+        <w:t>Why I hardcoded</w:t>
+      </w:r>
+      <w:r>
+        <w:rPr>
+          <w:b/>
+          <w:bCs/>
+          <w:sz w:val="22"/>
+          <w:szCs w:val="22"/>
+        </w:rPr>
+        <w:t>:</w:t>
+      </w:r>
+      <w:r>
+        <w:rPr>
+          <w:sz w:val="22"/>
+          <w:szCs w:val="22"/>
+        </w:rPr>
+        <w:t xml:space="preserve"> </w:t>
+      </w:r>
+      <w:r>
+        <w:rPr>
+          <w:sz w:val="22"/>
+          <w:szCs w:val="22"/>
+        </w:rPr>
+        <w:t xml:space="preserve">since the we </w:t>
+      </w:r>
+      <w:proofErr w:type="gramStart"/>
+      <w:r>
+        <w:rPr>
+          <w:sz w:val="22"/>
+          <w:szCs w:val="22"/>
+        </w:rPr>
+        <w:t>are not able to</w:t>
+      </w:r>
+      <w:proofErr w:type="gramEnd"/>
+      <w:r>
+        <w:rPr>
+          <w:sz w:val="22"/>
+          <w:szCs w:val="22"/>
+        </w:rPr>
+        <w:t xml:space="preserve"> access the </w:t>
+      </w:r>
+      <w:proofErr w:type="spellStart"/>
+      <w:r>
+        <w:rPr>
+          <w:sz w:val="22"/>
+          <w:szCs w:val="22"/>
+        </w:rPr>
+        <w:t>screts</w:t>
+      </w:r>
+      <w:proofErr w:type="spellEnd"/>
+      <w:r>
+        <w:rPr>
+          <w:sz w:val="22"/>
+          <w:szCs w:val="22"/>
+        </w:rPr>
+        <w:t xml:space="preserve"> in the main repository</w:t>
+      </w:r>
+    </w:p>
+    <w:p>
+      <w:pPr>
+        <w:pBdr>
+          <w:bottom w:val="single" w:sz="6" w:space="1" w:color="auto"/>
+        </w:pBdr>
+        <w:spacing w:after="120"/>
+        <w:rPr>
+          <w:sz w:val="22"/>
+          <w:szCs w:val="22"/>
+        </w:rPr>
+      </w:pPr>
+    </w:p>
+    <w:p>
+      <w:pPr>
+        <w:rPr>
+          <w:b/>
+          <w:bCs/>
+          <w:sz w:val="28"/>
+          <w:szCs w:val="28"/>
+        </w:rPr>
+      </w:pPr>
+      <w:r>
+        <w:rPr>
+          <w:b/>
+          <w:bCs/>
+          <w:sz w:val="28"/>
+          <w:szCs w:val="28"/>
+        </w:rPr>
+        <w:t>Framework</w:t>
+      </w:r>
+      <w:r>
+        <w:rPr>
+          <w:b/>
+          <w:bCs/>
+          <w:sz w:val="28"/>
+          <w:szCs w:val="28"/>
+        </w:rPr>
+        <w:t xml:space="preserve"> – Selenide</w:t>
+      </w:r>
+    </w:p>
+    <w:p>
+      <w:pPr>
+        <w:rPr>
+          <w:sz w:val="22"/>
+          <w:szCs w:val="22"/>
+        </w:rPr>
+      </w:pPr>
+      <w:r>
+        <w:rPr>
+          <w:sz w:val="22"/>
+          <w:szCs w:val="22"/>
+        </w:rPr>
+        <w:t xml:space="preserve">The test uses page as a model framework in which it contains </w:t>
+      </w:r>
+      <w:proofErr w:type="gramStart"/>
+      <w:r>
+        <w:rPr>
+          <w:sz w:val="22"/>
+          <w:szCs w:val="22"/>
+        </w:rPr>
+        <w:t>pages ,</w:t>
+      </w:r>
+      <w:proofErr w:type="gramEnd"/>
+      <w:r>
+        <w:rPr>
+          <w:sz w:val="22"/>
+          <w:szCs w:val="22"/>
+        </w:rPr>
+        <w:t xml:space="preserve"> flows, fixtures, tests as the directory</w:t>
+      </w:r>
+    </w:p>
+    <w:p>
+      <w:pPr>
+        <w:rPr>
+          <w:b/>
+          <w:bCs/>
+        </w:rPr>
+      </w:pPr>
+      <w:r>
+        <w:rPr>
+          <w:b/>
+          <w:bCs/>
+        </w:rPr>
+        <w:t>Page:</w:t>
+      </w:r>
+    </w:p>
+    <w:p>
+      <w:pPr>
+        <w:rPr>
+          <w:sz w:val="22"/>
+          <w:szCs w:val="22"/>
+        </w:rPr>
+      </w:pPr>
+      <w:r>
+        <w:rPr>
+          <w:sz w:val="22"/>
+          <w:szCs w:val="22"/>
+        </w:rPr>
+        <w:t xml:space="preserve">Page contains a </w:t>
+      </w:r>
+      <w:r>
+        <w:rPr>
+          <w:sz w:val="22"/>
+          <w:szCs w:val="22"/>
+        </w:rPr>
+        <w:t>java</w:t>
+      </w:r>
+      <w:r>
+        <w:rPr>
+          <w:sz w:val="22"/>
+          <w:szCs w:val="22"/>
+        </w:rPr>
+        <w:t xml:space="preserve"> class which will have all the needed function in the website page as </w:t>
+      </w:r>
+      <w:proofErr w:type="gramStart"/>
+      <w:r>
+        <w:rPr>
+          <w:sz w:val="22"/>
+          <w:szCs w:val="22"/>
+        </w:rPr>
+        <w:t>method ,</w:t>
+      </w:r>
+      <w:proofErr w:type="gramEnd"/>
+      <w:r>
+        <w:rPr>
+          <w:sz w:val="22"/>
+          <w:szCs w:val="22"/>
+        </w:rPr>
+        <w:t xml:space="preserve"> and </w:t>
+      </w:r>
+      <w:r>
+        <w:rPr>
+          <w:sz w:val="22"/>
+          <w:szCs w:val="22"/>
+        </w:rPr>
+        <w:t>selenide/selenium</w:t>
+      </w:r>
+      <w:r>
+        <w:rPr>
+          <w:sz w:val="22"/>
+          <w:szCs w:val="22"/>
+        </w:rPr>
+        <w:t>. The page does not have any assertion only action will be there.</w:t>
+      </w:r>
+    </w:p>
+    <w:p>
+      <w:pPr>
+        <w:pStyle w:val="ListParagraph"/>
+        <w:numPr>
+          <w:ilvl w:val="0"/>
+          <w:numId w:val="7"/>
+        </w:numPr>
+        <w:rPr>
+          <w:b/>
+          <w:bCs/>
+          <w:sz w:val="22"/>
+          <w:szCs w:val="22"/>
+        </w:rPr>
+      </w:pPr>
+      <w:proofErr w:type="gramStart"/>
+      <w:r>
+        <w:rPr>
+          <w:b/>
+          <w:bCs/>
+          <w:sz w:val="22"/>
+          <w:szCs w:val="22"/>
+        </w:rPr>
+        <w:t>CatalogPage</w:t>
+      </w:r>
+      <w:r>
+        <w:rPr>
+          <w:b/>
+          <w:bCs/>
+          <w:sz w:val="22"/>
+          <w:szCs w:val="22"/>
+        </w:rPr>
+        <w:t>.</w:t>
+      </w:r>
+      <w:r>
+        <w:rPr>
+          <w:b/>
+          <w:bCs/>
+          <w:sz w:val="22"/>
+          <w:szCs w:val="22"/>
+        </w:rPr>
+        <w:t>java</w:t>
+      </w:r>
+      <w:r>
+        <w:rPr>
+          <w:b/>
+          <w:bCs/>
+          <w:sz w:val="22"/>
+          <w:szCs w:val="22"/>
+        </w:rPr>
+        <w:t xml:space="preserve"> </w:t>
+      </w:r>
+      <w:r>
+        <w:rPr>
+          <w:b/>
+          <w:bCs/>
+          <w:sz w:val="22"/>
+          <w:szCs w:val="22"/>
+        </w:rPr>
+        <w:t>:</w:t>
+      </w:r>
+      <w:proofErr w:type="gramEnd"/>
+      <w:r>
+        <w:rPr>
+          <w:b/>
+          <w:bCs/>
+          <w:sz w:val="22"/>
+          <w:szCs w:val="22"/>
+        </w:rPr>
+        <w:t xml:space="preserve"> </w:t>
+      </w:r>
+      <w:r>
+        <w:rPr>
+          <w:sz w:val="22"/>
+          <w:szCs w:val="22"/>
+        </w:rPr>
+        <w:t xml:space="preserve">In this we have </w:t>
+      </w:r>
+      <w:proofErr w:type="spellStart"/>
+      <w:r>
+        <w:rPr>
+          <w:sz w:val="22"/>
+          <w:szCs w:val="22"/>
+        </w:rPr>
+        <w:t>catalog</w:t>
+      </w:r>
+      <w:proofErr w:type="spellEnd"/>
+      <w:r>
+        <w:rPr>
+          <w:sz w:val="22"/>
+          <w:szCs w:val="22"/>
+        </w:rPr>
+        <w:t xml:space="preserve"> page as the class in that we have so many locators and methods </w:t>
+      </w:r>
+      <w:proofErr w:type="spellStart"/>
+      <w:proofErr w:type="gramStart"/>
+      <w:r>
+        <w:rPr>
+          <w:sz w:val="22"/>
+          <w:szCs w:val="22"/>
+        </w:rPr>
+        <w:t>openPage</w:t>
+      </w:r>
+      <w:proofErr w:type="spellEnd"/>
+      <w:r>
+        <w:rPr>
+          <w:sz w:val="22"/>
+          <w:szCs w:val="22"/>
+        </w:rPr>
+        <w:t xml:space="preserve"> ,</w:t>
+      </w:r>
+      <w:proofErr w:type="gramEnd"/>
+      <w:r>
+        <w:rPr>
+          <w:sz w:val="22"/>
+          <w:szCs w:val="22"/>
+        </w:rPr>
+        <w:t xml:space="preserve"> </w:t>
+      </w:r>
+      <w:proofErr w:type="spellStart"/>
+      <w:proofErr w:type="gramStart"/>
+      <w:r>
+        <w:rPr>
+          <w:sz w:val="22"/>
+          <w:szCs w:val="22"/>
+        </w:rPr>
+        <w:t>verifyResult</w:t>
+      </w:r>
+      <w:proofErr w:type="spellEnd"/>
+      <w:r>
+        <w:rPr>
+          <w:sz w:val="22"/>
+          <w:szCs w:val="22"/>
+        </w:rPr>
+        <w:t xml:space="preserve"> ,</w:t>
+      </w:r>
+      <w:proofErr w:type="spellStart"/>
+      <w:r>
+        <w:rPr>
+          <w:sz w:val="22"/>
+          <w:szCs w:val="22"/>
+        </w:rPr>
+        <w:t>searchProduct</w:t>
+      </w:r>
+      <w:proofErr w:type="spellEnd"/>
+      <w:proofErr w:type="gramEnd"/>
+      <w:r>
+        <w:rPr>
+          <w:sz w:val="22"/>
+          <w:szCs w:val="22"/>
+        </w:rPr>
+        <w:t xml:space="preserve">, </w:t>
+      </w:r>
+      <w:proofErr w:type="spellStart"/>
+      <w:r>
+        <w:rPr>
+          <w:sz w:val="22"/>
+          <w:szCs w:val="22"/>
+        </w:rPr>
+        <w:t>openFirstProduct</w:t>
+      </w:r>
+      <w:proofErr w:type="spellEnd"/>
+      <w:r>
+        <w:rPr>
+          <w:sz w:val="22"/>
+          <w:szCs w:val="22"/>
+        </w:rPr>
+        <w:t>;</w:t>
+      </w:r>
+    </w:p>
+    <w:p>
+      <w:pPr>
+        <w:pStyle w:val="ListParagraph"/>
+        <w:rPr>
+          <w:b/>
+          <w:bCs/>
+          <w:sz w:val="22"/>
+          <w:szCs w:val="22"/>
+        </w:rPr>
+      </w:pPr>
+      <w:r>
+        <w:rPr>
+          <w:b/>
+          <w:bCs/>
+          <w:sz w:val="22"/>
+          <w:szCs w:val="22"/>
+        </w:rPr>
+        <w:drawing>
+          <wp:inline distT="0" distB="0" distL="0" distR="0" wp14:anchorId="724720AE" wp14:editId="7E53C916">
+            <wp:extent cx="4953760" cy="3219450"/>
+            <wp:effectExtent l="0" t="0" r="0" b="0"/>
+            <wp:docPr id="1812660664" name="Picture 1"/>
+            <wp:cNvGraphicFramePr>
+              <a:graphicFrameLocks xmlns:a="http://schemas.openxmlformats.org/drawingml/2006/main" noChangeAspect="1"/>
+            </wp:cNvGraphicFramePr>
+            <a:graphic xmlns:a="http://schemas.openxmlformats.org/drawingml/2006/main">
+              <a:graphicData uri="http://schemas.openxmlformats.org/drawingml/2006/picture">
+                <pic:pic xmlns:pic="http://schemas.openxmlformats.org/drawingml/2006/picture">
+                  <pic:nvPicPr>
+                    <pic:cNvPr id="1812660664" name=""/>
+                    <pic:cNvPicPr/>
+                  </pic:nvPicPr>
+                  <pic:blipFill>
+                    <a:blip r:embed="rId8"/>
+                    <a:stretch>
+                      <a:fillRect/>
+                    </a:stretch>
+                  </pic:blipFill>
+                  <pic:spPr>
+                    <a:xfrm>
+                      <a:off x="0" y="0"/>
+                      <a:ext cx="4958547" cy="3222561"/>
+                    </a:xfrm>
+                    <a:prstGeom prst="rect">
+                      <a:avLst/>
+                    </a:prstGeom>
+                  </pic:spPr>
+                </pic:pic>
+              </a:graphicData>
+            </a:graphic>
+          </wp:inline>
+        </w:drawing>
+      </w:r>
+    </w:p>
+    <w:p>
+      <w:pPr>
+        <w:pStyle w:val="ListParagraph"/>
+        <w:numPr>
+          <w:ilvl w:val="0"/>
+          <w:numId w:val="7"/>
+        </w:numPr>
+        <w:rPr>
+          <w:b/>
+          <w:bCs/>
+          <w:sz w:val="22"/>
+          <w:szCs w:val="22"/>
+        </w:rPr>
+      </w:pPr>
+      <w:proofErr w:type="gramStart"/>
+      <w:r>
+        <w:rPr>
+          <w:b/>
+          <w:bCs/>
+          <w:sz w:val="22"/>
+          <w:szCs w:val="22"/>
+        </w:rPr>
+        <w:lastRenderedPageBreak/>
+        <w:t>ProductPage.java :</w:t>
+      </w:r>
+      <w:proofErr w:type="gramEnd"/>
+      <w:r>
+        <w:rPr>
+          <w:b/>
+          <w:bCs/>
+          <w:sz w:val="22"/>
+          <w:szCs w:val="22"/>
+        </w:rPr>
+        <w:t xml:space="preserve"> </w:t>
+      </w:r>
+      <w:r>
+        <w:rPr>
+          <w:sz w:val="22"/>
+          <w:szCs w:val="22"/>
+        </w:rPr>
+        <w:t xml:space="preserve">In this we have </w:t>
+      </w:r>
+      <w:r>
+        <w:rPr>
+          <w:sz w:val="22"/>
+          <w:szCs w:val="22"/>
+        </w:rPr>
+        <w:t>Product detail /PDP</w:t>
+      </w:r>
+      <w:r>
+        <w:rPr>
+          <w:sz w:val="22"/>
+          <w:szCs w:val="22"/>
+        </w:rPr>
+        <w:t xml:space="preserve"> page as the class in that we have so many locators and methods </w:t>
+      </w:r>
+      <w:proofErr w:type="spellStart"/>
+      <w:r>
+        <w:rPr>
+          <w:sz w:val="22"/>
+          <w:szCs w:val="22"/>
+        </w:rPr>
+        <w:t>openProduct</w:t>
+      </w:r>
+      <w:proofErr w:type="spellEnd"/>
+      <w:r>
+        <w:rPr>
+          <w:sz w:val="22"/>
+          <w:szCs w:val="22"/>
+        </w:rPr>
+        <w:t xml:space="preserve">, </w:t>
+      </w:r>
+      <w:proofErr w:type="spellStart"/>
+      <w:r>
+        <w:rPr>
+          <w:sz w:val="22"/>
+          <w:szCs w:val="22"/>
+        </w:rPr>
+        <w:t>abilityBadgeVisible</w:t>
+      </w:r>
+      <w:proofErr w:type="spellEnd"/>
+      <w:r>
+        <w:rPr>
+          <w:sz w:val="22"/>
+          <w:szCs w:val="22"/>
+        </w:rPr>
+        <w:drawing>
+          <wp:inline distT="0" distB="0" distL="0" distR="0" wp14:anchorId="4B91DAAA" wp14:editId="2295623F">
+            <wp:extent cx="5331286" cy="2241550"/>
+            <wp:effectExtent l="0" t="0" r="3175" b="6350"/>
+            <wp:docPr id="1670885436" name="Picture 1"/>
+            <wp:cNvGraphicFramePr>
+              <a:graphicFrameLocks xmlns:a="http://schemas.openxmlformats.org/drawingml/2006/main" noChangeAspect="1"/>
+            </wp:cNvGraphicFramePr>
+            <a:graphic xmlns:a="http://schemas.openxmlformats.org/drawingml/2006/main">
+              <a:graphicData uri="http://schemas.openxmlformats.org/drawingml/2006/picture">
+                <pic:pic xmlns:pic="http://schemas.openxmlformats.org/drawingml/2006/picture">
+                  <pic:nvPicPr>
+                    <pic:cNvPr id="1670885436" name=""/>
+                    <pic:cNvPicPr/>
+                  </pic:nvPicPr>
+                  <pic:blipFill>
+                    <a:blip r:embed="rId9"/>
+                    <a:stretch>
+                      <a:fillRect/>
+                    </a:stretch>
+                  </pic:blipFill>
+                  <pic:spPr>
+                    <a:xfrm>
+                      <a:off x="0" y="0"/>
+                      <a:ext cx="5332882" cy="2242221"/>
+                    </a:xfrm>
+                    <a:prstGeom prst="rect">
+                      <a:avLst/>
+                    </a:prstGeom>
+                  </pic:spPr>
+                </pic:pic>
+              </a:graphicData>
+            </a:graphic>
+          </wp:inline>
+        </w:drawing>
+      </w:r>
+    </w:p>
+    <w:p>
+      <w:pPr>
+        <w:pStyle w:val="ListParagraph"/>
+        <w:rPr>
+          <w:b/>
+          <w:bCs/>
+          <w:sz w:val="22"/>
+          <w:szCs w:val="22"/>
+        </w:rPr>
+      </w:pPr>
+    </w:p>
+    <w:p>
+      <w:pPr>
+        <w:rPr>
+          <w:b/>
+          <w:bCs/>
+          <w:sz w:val="22"/>
+          <w:szCs w:val="22"/>
+        </w:rPr>
+      </w:pPr>
+    </w:p>
+    <w:p>
+      <w:pPr>
+        <w:rPr>
+          <w:b/>
+          <w:bCs/>
+        </w:rPr>
+      </w:pPr>
+      <w:r>
+        <w:rPr>
+          <w:b/>
+          <w:bCs/>
+        </w:rPr>
+        <w:t>Flow</w:t>
+      </w:r>
+      <w:r>
+        <w:rPr>
+          <w:b/>
+          <w:bCs/>
+        </w:rPr>
+        <w:t>:</w:t>
+      </w:r>
+    </w:p>
+    <w:p>
+      <w:pPr>
+        <w:rPr>
+          <w:sz w:val="22"/>
+          <w:szCs w:val="22"/>
+        </w:rPr>
+      </w:pPr>
+      <w:r>
+        <w:rPr>
+          <w:sz w:val="22"/>
+          <w:szCs w:val="22"/>
+        </w:rPr>
+        <w:t xml:space="preserve">Flow contains a </w:t>
+      </w:r>
+      <w:r>
+        <w:rPr>
+          <w:sz w:val="22"/>
+          <w:szCs w:val="22"/>
+        </w:rPr>
+        <w:t xml:space="preserve">java class which contains all the </w:t>
+      </w:r>
+      <w:proofErr w:type="gramStart"/>
+      <w:r>
+        <w:rPr>
+          <w:sz w:val="22"/>
+          <w:szCs w:val="22"/>
+        </w:rPr>
+        <w:t>pages</w:t>
+      </w:r>
+      <w:proofErr w:type="gramEnd"/>
+      <w:r>
+        <w:rPr>
+          <w:sz w:val="22"/>
+          <w:szCs w:val="22"/>
+        </w:rPr>
+        <w:t xml:space="preserve"> and I will do the expected action since we are trying to chain one method to another every method is returning a page.</w:t>
+      </w:r>
+    </w:p>
+    <w:p>
+      <w:pPr>
+        <w:rPr>
+          <w:sz w:val="22"/>
+          <w:szCs w:val="22"/>
+        </w:rPr>
+      </w:pPr>
+      <w:proofErr w:type="gramStart"/>
+      <w:r>
+        <w:rPr>
+          <w:b/>
+          <w:bCs/>
+          <w:sz w:val="22"/>
+          <w:szCs w:val="22"/>
+        </w:rPr>
+        <w:t>SearchFlow</w:t>
+      </w:r>
+      <w:r>
+        <w:rPr>
+          <w:b/>
+          <w:bCs/>
+          <w:sz w:val="22"/>
+          <w:szCs w:val="22"/>
+        </w:rPr>
+        <w:t>.</w:t>
+      </w:r>
+      <w:r>
+        <w:rPr>
+          <w:b/>
+          <w:bCs/>
+          <w:sz w:val="22"/>
+          <w:szCs w:val="22"/>
+        </w:rPr>
+        <w:t>java</w:t>
+      </w:r>
+      <w:r>
+        <w:rPr>
+          <w:b/>
+          <w:bCs/>
+          <w:sz w:val="22"/>
+          <w:szCs w:val="22"/>
+        </w:rPr>
+        <w:t xml:space="preserve"> </w:t>
+      </w:r>
+      <w:r>
+        <w:rPr>
+          <w:b/>
+          <w:bCs/>
+          <w:sz w:val="22"/>
+          <w:szCs w:val="22"/>
+        </w:rPr>
+        <w:t>:</w:t>
+      </w:r>
+      <w:proofErr w:type="gramEnd"/>
+      <w:r>
+        <w:rPr>
+          <w:b/>
+          <w:bCs/>
+          <w:sz w:val="22"/>
+          <w:szCs w:val="22"/>
+        </w:rPr>
+        <w:t xml:space="preserve"> </w:t>
+      </w:r>
+      <w:r>
+        <w:rPr>
+          <w:sz w:val="22"/>
+          <w:szCs w:val="22"/>
+        </w:rPr>
+        <w:t xml:space="preserve">In </w:t>
+      </w:r>
+      <w:proofErr w:type="spellStart"/>
+      <w:r>
+        <w:rPr>
+          <w:sz w:val="22"/>
+          <w:szCs w:val="22"/>
+        </w:rPr>
+        <w:t>SearchFlow</w:t>
+      </w:r>
+      <w:proofErr w:type="spellEnd"/>
+      <w:r>
+        <w:rPr>
+          <w:sz w:val="22"/>
+          <w:szCs w:val="22"/>
+        </w:rPr>
+        <w:t xml:space="preserve"> contain all the methods need for to create the flow we </w:t>
+      </w:r>
+      <w:proofErr w:type="gramStart"/>
+      <w:r>
+        <w:rPr>
+          <w:sz w:val="22"/>
+          <w:szCs w:val="22"/>
+        </w:rPr>
+        <w:t xml:space="preserve">decided  </w:t>
+      </w:r>
+      <w:r>
+        <w:rPr>
+          <w:sz w:val="22"/>
+          <w:szCs w:val="22"/>
+        </w:rPr>
+        <w:t>the</w:t>
+      </w:r>
+      <w:proofErr w:type="gramEnd"/>
+      <w:r>
+        <w:rPr>
+          <w:sz w:val="22"/>
+          <w:szCs w:val="22"/>
+        </w:rPr>
+        <w:t xml:space="preserve"> methods are </w:t>
+      </w:r>
+    </w:p>
+    <w:p>
+      <w:pPr>
+        <w:pStyle w:val="ListParagraph"/>
+        <w:numPr>
+          <w:ilvl w:val="0"/>
+          <w:numId w:val="8"/>
+        </w:numPr>
+        <w:rPr>
+          <w:sz w:val="22"/>
+          <w:szCs w:val="22"/>
+        </w:rPr>
+      </w:pPr>
+      <w:proofErr w:type="spellStart"/>
+      <w:r>
+        <w:rPr>
+          <w:b/>
+          <w:bCs/>
+          <w:sz w:val="22"/>
+          <w:szCs w:val="22"/>
+        </w:rPr>
+        <w:t>Consturctur</w:t>
+      </w:r>
+      <w:proofErr w:type="spellEnd"/>
+      <w:r>
+        <w:rPr>
+          <w:b/>
+          <w:bCs/>
+          <w:sz w:val="22"/>
+          <w:szCs w:val="22"/>
+        </w:rPr>
+        <w:t xml:space="preserve">: </w:t>
+      </w:r>
+      <w:r>
+        <w:rPr>
+          <w:sz w:val="22"/>
+          <w:szCs w:val="22"/>
+        </w:rPr>
+        <w:t xml:space="preserve">initialise the </w:t>
+      </w:r>
+      <w:proofErr w:type="spellStart"/>
+      <w:r>
+        <w:rPr>
+          <w:sz w:val="22"/>
+          <w:szCs w:val="22"/>
+        </w:rPr>
+        <w:t>Catalog</w:t>
+      </w:r>
+      <w:proofErr w:type="spellEnd"/>
+      <w:r>
+        <w:rPr>
+          <w:sz w:val="22"/>
+          <w:szCs w:val="22"/>
+        </w:rPr>
+        <w:t xml:space="preserve"> page and Product Page</w:t>
+      </w:r>
+    </w:p>
+    <w:p>
+      <w:pPr>
+        <w:pStyle w:val="ListParagraph"/>
+        <w:numPr>
+          <w:ilvl w:val="0"/>
+          <w:numId w:val="8"/>
+        </w:numPr>
+        <w:rPr>
+          <w:sz w:val="22"/>
+          <w:szCs w:val="22"/>
+        </w:rPr>
+      </w:pPr>
+      <w:proofErr w:type="gramStart"/>
+      <w:r>
+        <w:rPr>
+          <w:b/>
+          <w:bCs/>
+          <w:sz w:val="22"/>
+          <w:szCs w:val="22"/>
+        </w:rPr>
+        <w:t xml:space="preserve">Search </w:t>
+      </w:r>
+      <w:r>
+        <w:rPr>
+          <w:b/>
+          <w:bCs/>
+          <w:sz w:val="22"/>
+          <w:szCs w:val="22"/>
+        </w:rPr>
+        <w:t>:</w:t>
+      </w:r>
+      <w:proofErr w:type="gramEnd"/>
+      <w:r>
+        <w:rPr>
+          <w:b/>
+          <w:bCs/>
+          <w:sz w:val="22"/>
+          <w:szCs w:val="22"/>
+        </w:rPr>
+        <w:t xml:space="preserve"> </w:t>
+      </w:r>
+      <w:r>
+        <w:rPr>
+          <w:sz w:val="22"/>
+          <w:szCs w:val="22"/>
+        </w:rPr>
+        <w:t xml:space="preserve">this method is used for </w:t>
+      </w:r>
+      <w:proofErr w:type="gramStart"/>
+      <w:r>
+        <w:rPr>
+          <w:sz w:val="22"/>
+          <w:szCs w:val="22"/>
+        </w:rPr>
+        <w:t>search</w:t>
+      </w:r>
+      <w:proofErr w:type="gramEnd"/>
+      <w:r>
+        <w:rPr>
+          <w:sz w:val="22"/>
+          <w:szCs w:val="22"/>
+        </w:rPr>
+        <w:t xml:space="preserve"> a product and validate the product </w:t>
+      </w:r>
+      <w:r>
+        <w:rPr>
+          <w:sz w:val="22"/>
+          <w:szCs w:val="22"/>
+        </w:rPr>
+        <w:t>card have the search key word</w:t>
+      </w:r>
+    </w:p>
+    <w:p>
+      <w:pPr>
+        <w:pStyle w:val="ListParagraph"/>
+        <w:numPr>
+          <w:ilvl w:val="0"/>
+          <w:numId w:val="8"/>
+        </w:numPr>
+        <w:rPr>
+          <w:b/>
+          <w:bCs/>
+          <w:sz w:val="28"/>
+          <w:szCs w:val="28"/>
+        </w:rPr>
+      </w:pPr>
+      <w:proofErr w:type="spellStart"/>
+      <w:r>
+        <w:rPr>
+          <w:b/>
+          <w:bCs/>
+          <w:sz w:val="22"/>
+          <w:szCs w:val="22"/>
+        </w:rPr>
+        <w:t>openCatalog</w:t>
+      </w:r>
+      <w:proofErr w:type="spellEnd"/>
+      <w:r>
+        <w:rPr>
+          <w:b/>
+          <w:bCs/>
+          <w:sz w:val="22"/>
+          <w:szCs w:val="22"/>
+        </w:rPr>
+        <w:t xml:space="preserve">: </w:t>
+      </w:r>
+      <w:r>
+        <w:rPr>
+          <w:sz w:val="22"/>
+          <w:szCs w:val="22"/>
+        </w:rPr>
+        <w:t xml:space="preserve">this method is used </w:t>
+      </w:r>
+      <w:r>
+        <w:rPr>
+          <w:sz w:val="22"/>
+          <w:szCs w:val="22"/>
+        </w:rPr>
+        <w:t xml:space="preserve">navigate to the </w:t>
+      </w:r>
+      <w:proofErr w:type="spellStart"/>
+      <w:r>
+        <w:rPr>
+          <w:sz w:val="22"/>
+          <w:szCs w:val="22"/>
+        </w:rPr>
+        <w:t>catalog</w:t>
+      </w:r>
+      <w:proofErr w:type="spellEnd"/>
+      <w:r>
+        <w:rPr>
+          <w:sz w:val="22"/>
+          <w:szCs w:val="22"/>
+        </w:rPr>
+        <w:t xml:space="preserve"> page</w:t>
+      </w:r>
+    </w:p>
+    <w:p>
+      <w:pPr>
+        <w:pStyle w:val="ListParagraph"/>
+        <w:numPr>
+          <w:ilvl w:val="0"/>
+          <w:numId w:val="8"/>
+        </w:numPr>
+        <w:rPr>
+          <w:b/>
+          <w:bCs/>
+          <w:sz w:val="28"/>
+          <w:szCs w:val="28"/>
+        </w:rPr>
+      </w:pPr>
+      <w:proofErr w:type="spellStart"/>
+      <w:r>
+        <w:rPr>
+          <w:b/>
+          <w:bCs/>
+          <w:sz w:val="22"/>
+          <w:szCs w:val="22"/>
+        </w:rPr>
+        <w:t>clickOnFirstProduct</w:t>
+      </w:r>
+      <w:proofErr w:type="spellEnd"/>
+      <w:r>
+        <w:rPr>
+          <w:b/>
+          <w:bCs/>
+          <w:sz w:val="22"/>
+          <w:szCs w:val="22"/>
+        </w:rPr>
+        <w:t xml:space="preserve">: </w:t>
+      </w:r>
+      <w:r>
+        <w:rPr>
+          <w:sz w:val="22"/>
+          <w:szCs w:val="22"/>
+        </w:rPr>
+        <w:t xml:space="preserve">this method is used </w:t>
+      </w:r>
+      <w:r>
+        <w:rPr>
+          <w:sz w:val="22"/>
+          <w:szCs w:val="22"/>
+        </w:rPr>
+        <w:t xml:space="preserve">navigate </w:t>
+      </w:r>
+      <w:proofErr w:type="spellStart"/>
+      <w:r>
+        <w:rPr>
+          <w:sz w:val="22"/>
+          <w:szCs w:val="22"/>
+        </w:rPr>
+        <w:t>clicjk</w:t>
+      </w:r>
+      <w:proofErr w:type="spellEnd"/>
+      <w:r>
+        <w:rPr>
+          <w:sz w:val="22"/>
+          <w:szCs w:val="22"/>
+        </w:rPr>
+        <w:t xml:space="preserve"> the first card and navigate to the product detail page</w:t>
+      </w:r>
+    </w:p>
+    <w:p>
+      <w:pPr>
+        <w:pStyle w:val="ListParagraph"/>
+        <w:numPr>
+          <w:ilvl w:val="0"/>
+          <w:numId w:val="8"/>
+        </w:numPr>
+        <w:rPr>
+          <w:b/>
+          <w:bCs/>
+          <w:sz w:val="28"/>
+          <w:szCs w:val="28"/>
+        </w:rPr>
+      </w:pPr>
+      <w:proofErr w:type="spellStart"/>
+      <w:r>
+        <w:rPr>
+          <w:b/>
+          <w:bCs/>
+          <w:sz w:val="22"/>
+          <w:szCs w:val="22"/>
+        </w:rPr>
+        <w:t>verifyAvalibilityBadgeisvisible</w:t>
+      </w:r>
+      <w:proofErr w:type="spellEnd"/>
+      <w:r>
+        <w:rPr>
+          <w:b/>
+          <w:bCs/>
+          <w:sz w:val="22"/>
+          <w:szCs w:val="22"/>
+        </w:rPr>
+        <w:t xml:space="preserve">: </w:t>
+      </w:r>
+      <w:r>
+        <w:rPr>
+          <w:sz w:val="22"/>
+          <w:szCs w:val="22"/>
+        </w:rPr>
+        <w:t xml:space="preserve">this method is used </w:t>
+      </w:r>
+      <w:r>
+        <w:rPr>
+          <w:sz w:val="22"/>
+          <w:szCs w:val="22"/>
+        </w:rPr>
+        <w:t>check whether the badge is visible</w:t>
+      </w:r>
+    </w:p>
+    <w:p>
+      <w:pPr>
+        <w:ind w:left="360"/>
+        <w:rPr>
+          <w:b/>
+          <w:bCs/>
+          <w:sz w:val="28"/>
+          <w:szCs w:val="28"/>
+        </w:rPr>
+      </w:pPr>
+    </w:p>
+    <w:p>
+      <w:pPr>
+        <w:ind w:left="360"/>
+        <w:rPr>
+          <w:b/>
+          <w:bCs/>
+          <w:sz w:val="28"/>
+          <w:szCs w:val="28"/>
+        </w:rPr>
+      </w:pPr>
+      <w:r>
+        <w:rPr>
+          <w:b/>
+          <w:bCs/>
+          <w:sz w:val="28"/>
+          <w:szCs w:val="28"/>
+        </w:rPr>
+        <w:lastRenderedPageBreak/>
+        <w:drawing>
+          <wp:inline distT="0" distB="0" distL="0" distR="0" wp14:anchorId="2B7FD95B" wp14:editId="486F9EBB">
+            <wp:extent cx="3905628" cy="4064000"/>
+            <wp:effectExtent l="0" t="0" r="0" b="0"/>
+            <wp:docPr id="1335694701" name="Picture 1"/>
+            <wp:cNvGraphicFramePr>
+              <a:graphicFrameLocks xmlns:a="http://schemas.openxmlformats.org/drawingml/2006/main" noChangeAspect="1"/>
+            </wp:cNvGraphicFramePr>
+            <a:graphic xmlns:a="http://schemas.openxmlformats.org/drawingml/2006/main">
+              <a:graphicData uri="http://schemas.openxmlformats.org/drawingml/2006/picture">
+                <pic:pic xmlns:pic="http://schemas.openxmlformats.org/drawingml/2006/picture">
+                  <pic:nvPicPr>
+                    <pic:cNvPr id="1335694701" name=""/>
+                    <pic:cNvPicPr/>
+                  </pic:nvPicPr>
+                  <pic:blipFill>
+                    <a:blip r:embed="rId10"/>
+                    <a:stretch>
+                      <a:fillRect/>
+                    </a:stretch>
+                  </pic:blipFill>
+                  <pic:spPr>
+                    <a:xfrm>
+                      <a:off x="0" y="0"/>
+                      <a:ext cx="3912509" cy="4071160"/>
+                    </a:xfrm>
+                    <a:prstGeom prst="rect">
+                      <a:avLst/>
+                    </a:prstGeom>
+                  </pic:spPr>
+                </pic:pic>
+              </a:graphicData>
+            </a:graphic>
+          </wp:inline>
+        </w:drawing>
+      </w:r>
+    </w:p>
+    <w:p>
+      <w:pPr>
+        <w:rPr>
+          <w:b/>
+          <w:bCs/>
+        </w:rPr>
+      </w:pPr>
+      <w:r>
+        <w:rPr>
+          <w:b/>
+          <w:bCs/>
+        </w:rPr>
+        <w:t>Fixtures</w:t>
+      </w:r>
+      <w:r>
+        <w:rPr>
+          <w:b/>
+          <w:bCs/>
+        </w:rPr>
+        <w:t>:</w:t>
+      </w:r>
+    </w:p>
+    <w:p>
+      <w:pPr>
+        <w:rPr>
+          <w:sz w:val="22"/>
+          <w:szCs w:val="22"/>
+        </w:rPr>
+      </w:pPr>
+      <w:r>
+        <w:rPr>
+          <w:sz w:val="22"/>
+          <w:szCs w:val="22"/>
+        </w:rPr>
+        <w:t>Contains constants values</w:t>
+      </w:r>
+    </w:p>
+    <w:p>
+      <w:pPr>
+        <w:rPr>
+          <w:sz w:val="22"/>
+          <w:szCs w:val="22"/>
+        </w:rPr>
+      </w:pPr>
+      <w:r>
+        <w:rPr>
+          <w:b/>
+          <w:bCs/>
+          <w:sz w:val="22"/>
+          <w:szCs w:val="22"/>
+        </w:rPr>
+        <w:drawing>
+          <wp:inline distT="0" distB="0" distL="0" distR="0" wp14:anchorId="4C8D0DAB" wp14:editId="674C2ACB">
+            <wp:extent cx="3352800" cy="735491"/>
+            <wp:effectExtent l="0" t="0" r="0" b="7620"/>
+            <wp:docPr id="2147468580" name="Picture 1"/>
+            <wp:cNvGraphicFramePr>
+              <a:graphicFrameLocks xmlns:a="http://schemas.openxmlformats.org/drawingml/2006/main" noChangeAspect="1"/>
+            </wp:cNvGraphicFramePr>
+            <a:graphic xmlns:a="http://schemas.openxmlformats.org/drawingml/2006/main">
+              <a:graphicData uri="http://schemas.openxmlformats.org/drawingml/2006/picture">
+                <pic:pic xmlns:pic="http://schemas.openxmlformats.org/drawingml/2006/picture">
+                  <pic:nvPicPr>
+                    <pic:cNvPr id="2147468580" name=""/>
+                    <pic:cNvPicPr/>
+                  </pic:nvPicPr>
+                  <pic:blipFill>
+                    <a:blip r:embed="rId11"/>
+                    <a:stretch>
+                      <a:fillRect/>
+                    </a:stretch>
+                  </pic:blipFill>
+                  <pic:spPr>
+                    <a:xfrm>
+                      <a:off x="0" y="0"/>
+                      <a:ext cx="3375853" cy="740548"/>
+                    </a:xfrm>
+                    <a:prstGeom prst="rect">
+                      <a:avLst/>
+                    </a:prstGeom>
+                  </pic:spPr>
+                </pic:pic>
+              </a:graphicData>
+            </a:graphic>
+          </wp:inline>
+        </w:drawing>
+      </w:r>
+    </w:p>
+    <w:p>
+      <w:pPr>
+        <w:rPr>
+          <w:b/>
+          <w:bCs/>
+        </w:rPr>
+      </w:pPr>
+      <w:proofErr w:type="gramStart"/>
+      <w:r>
+        <w:rPr>
+          <w:b/>
+          <w:bCs/>
+        </w:rPr>
+        <w:t>Support :</w:t>
+      </w:r>
+      <w:proofErr w:type="gramEnd"/>
+    </w:p>
+    <w:p>
+      <w:pPr>
+        <w:rPr>
+          <w:sz w:val="22"/>
+          <w:szCs w:val="22"/>
+        </w:rPr>
+      </w:pPr>
+      <w:r>
+        <w:rPr>
+          <w:sz w:val="22"/>
+          <w:szCs w:val="22"/>
+        </w:rPr>
+        <w:t xml:space="preserve">Support file contains all the configuration need for the </w:t>
+      </w:r>
+      <w:r>
+        <w:rPr>
+          <w:sz w:val="22"/>
+          <w:szCs w:val="22"/>
+        </w:rPr>
+        <w:t>test to run.</w:t>
+      </w:r>
+      <w:r>
+        <w:rPr>
+          <w:sz w:val="22"/>
+          <w:szCs w:val="22"/>
+        </w:rPr>
+        <w:t xml:space="preserve"> </w:t>
+      </w:r>
+    </w:p>
+    <w:p>
+      <w:pPr>
+        <w:rPr>
+          <w:b/>
+          <w:bCs/>
+        </w:rPr>
+      </w:pPr>
+    </w:p>
+    <w:p>
+      <w:pPr>
+        <w:rPr>
+          <w:sz w:val="22"/>
+          <w:szCs w:val="22"/>
+        </w:rPr>
+      </w:pPr>
+      <w:r>
+        <w:rPr>
+          <w:sz w:val="22"/>
+          <w:szCs w:val="22"/>
+        </w:rPr>
+        <w:drawing>
+          <wp:inline distT="0" distB="0" distL="0" distR="0" wp14:anchorId="7DBD4A58" wp14:editId="2FD2F5C6">
+            <wp:extent cx="4513800" cy="1974850"/>
+            <wp:effectExtent l="0" t="0" r="1270" b="6350"/>
+            <wp:docPr id="1541322444" name="Picture 1"/>
+            <wp:cNvGraphicFramePr>
+              <a:graphicFrameLocks xmlns:a="http://schemas.openxmlformats.org/drawingml/2006/main" noChangeAspect="1"/>
+            </wp:cNvGraphicFramePr>
+            <a:graphic xmlns:a="http://schemas.openxmlformats.org/drawingml/2006/main">
+              <a:graphicData uri="http://schemas.openxmlformats.org/drawingml/2006/picture">
+                <pic:pic xmlns:pic="http://schemas.openxmlformats.org/drawingml/2006/picture">
+                  <pic:nvPicPr>
+                    <pic:cNvPr id="1541322444" name=""/>
+                    <pic:cNvPicPr/>
+                  </pic:nvPicPr>
+                  <pic:blipFill>
+                    <a:blip r:embed="rId12"/>
+                    <a:stretch>
+                      <a:fillRect/>
+                    </a:stretch>
+                  </pic:blipFill>
+                  <pic:spPr>
+                    <a:xfrm>
+                      <a:off x="0" y="0"/>
+                      <a:ext cx="4517071" cy="1976281"/>
+                    </a:xfrm>
+                    <a:prstGeom prst="rect">
+                      <a:avLst/>
+                    </a:prstGeom>
+                  </pic:spPr>
+                </pic:pic>
+              </a:graphicData>
+            </a:graphic>
+          </wp:inline>
+        </w:drawing>
+      </w:r>
+    </w:p>
+    <w:p>
+      <w:pPr>
+        <w:rPr>
+          <w:sz w:val="22"/>
+          <w:szCs w:val="22"/>
+        </w:rPr>
+      </w:pPr>
+    </w:p>
+    <w:p>
+      <w:pPr>
+        <w:rPr>
+          <w:b/>
+          <w:bCs/>
+        </w:rPr>
+      </w:pPr>
+      <w:r>
+        <w:rPr>
+          <w:b/>
+          <w:bCs/>
+        </w:rPr>
+        <w:t>Tests</w:t>
+      </w:r>
+      <w:r>
+        <w:rPr>
+          <w:b/>
+          <w:bCs/>
+        </w:rPr>
+        <w:t>:</w:t>
+      </w:r>
+    </w:p>
+    <w:p>
+      <w:pPr>
+        <w:rPr>
+          <w:sz w:val="22"/>
+          <w:szCs w:val="22"/>
+        </w:rPr>
+      </w:pPr>
+      <w:r>
+        <w:rPr>
+          <w:sz w:val="22"/>
+          <w:szCs w:val="22"/>
+        </w:rPr>
+        <w:t xml:space="preserve">Test contains </w:t>
+      </w:r>
+      <w:proofErr w:type="spellStart"/>
+      <w:r>
+        <w:rPr>
+          <w:sz w:val="22"/>
+          <w:szCs w:val="22"/>
+        </w:rPr>
+        <w:t>testfiles</w:t>
+      </w:r>
+      <w:proofErr w:type="spellEnd"/>
+    </w:p>
+    <w:p>
+      <w:pPr>
+        <w:rPr>
+          <w:sz w:val="22"/>
+          <w:szCs w:val="22"/>
+        </w:rPr>
+      </w:pPr>
+      <w:r>
+        <w:rPr>
+          <w:b/>
+          <w:bCs/>
+          <w:sz w:val="22"/>
+          <w:szCs w:val="22"/>
+        </w:rPr>
+        <w:t>SelenideTest</w:t>
+      </w:r>
+      <w:r>
+        <w:rPr>
+          <w:b/>
+          <w:bCs/>
+          <w:sz w:val="22"/>
+          <w:szCs w:val="22"/>
+        </w:rPr>
+        <w:t>.java</w:t>
+      </w:r>
+      <w:r>
+        <w:rPr>
+          <w:b/>
+          <w:bCs/>
+          <w:sz w:val="22"/>
+          <w:szCs w:val="22"/>
+        </w:rPr>
+        <w:t xml:space="preserve">: </w:t>
+      </w:r>
+      <w:r>
+        <w:rPr>
+          <w:sz w:val="22"/>
+          <w:szCs w:val="22"/>
+        </w:rPr>
+        <w:t>In the class we will define the</w:t>
+      </w:r>
+      <w:r>
+        <w:rPr>
+          <w:sz w:val="22"/>
+          <w:szCs w:val="22"/>
+        </w:rPr>
+        <w:t xml:space="preserve"> test</w:t>
+      </w:r>
+    </w:p>
+    <w:p>
+      <w:pPr>
+        <w:pBdr>
+          <w:bottom w:val="single" w:sz="6" w:space="1" w:color="auto"/>
+        </w:pBdr>
+        <w:rPr>
+          <w:sz w:val="22"/>
+          <w:szCs w:val="22"/>
+        </w:rPr>
+      </w:pPr>
+      <w:r>
+        <w:rPr>
+          <w:sz w:val="22"/>
+          <w:szCs w:val="22"/>
+        </w:rPr>
+        <w:drawing>
+          <wp:inline distT="0" distB="0" distL="0" distR="0" wp14:anchorId="41E0DAB5" wp14:editId="049936AC">
+            <wp:extent cx="5731510" cy="4117975"/>
+            <wp:effectExtent l="0" t="0" r="2540" b="0"/>
+            <wp:docPr id="1162084291" name="Picture 1"/>
+            <wp:cNvGraphicFramePr>
+              <a:graphicFrameLocks xmlns:a="http://schemas.openxmlformats.org/drawingml/2006/main" noChangeAspect="1"/>
+            </wp:cNvGraphicFramePr>
+            <a:graphic xmlns:a="http://schemas.openxmlformats.org/drawingml/2006/main">
+              <a:graphicData uri="http://schemas.openxmlformats.org/drawingml/2006/picture">
+                <pic:pic xmlns:pic="http://schemas.openxmlformats.org/drawingml/2006/picture">
+                  <pic:nvPicPr>
+                    <pic:cNvPr id="1162084291" name=""/>
+                    <pic:cNvPicPr/>
+                  </pic:nvPicPr>
+                  <pic:blipFill>
+                    <a:blip r:embed="rId13"/>
+                    <a:stretch>
+                      <a:fillRect/>
+                    </a:stretch>
+                  </pic:blipFill>
+                  <pic:spPr>
+                    <a:xfrm>
+                      <a:off x="0" y="0"/>
+                      <a:ext cx="5731510" cy="4117975"/>
+                    </a:xfrm>
+                    <a:prstGeom prst="rect">
+                      <a:avLst/>
+                    </a:prstGeom>
+                  </pic:spPr>
+                </pic:pic>
+              </a:graphicData>
+            </a:graphic>
+          </wp:inline>
+        </w:drawing>
+      </w:r>
+    </w:p>
+    <w:p>
+      <w:pPr>
+        <w:rPr>
+          <w:sz w:val="22"/>
+          <w:szCs w:val="22"/>
+        </w:rPr>
+      </w:pPr>
+    </w:p>
+    <w:p>
+      <w:pPr>
+        <w:rPr>
+          <w:b/>
+          <w:bCs/>
+          <w:sz w:val="28"/>
+          <w:szCs w:val="28"/>
+        </w:rPr>
+      </w:pPr>
+      <w:r>
+        <w:rPr>
+          <w:b/>
+          <w:bCs/>
+          <w:sz w:val="28"/>
+          <w:szCs w:val="28"/>
+        </w:rPr>
+        <w:t>Project Structure:</w:t>
+      </w:r>
+    </w:p>
+    <w:p>
+      <w:pPr>
+        <w:rPr>
+          <w:b/>
+          <w:bCs/>
+          <w:sz w:val="28"/>
+          <w:szCs w:val="28"/>
+        </w:rPr>
+      </w:pPr>
+    </w:p>
+    <w:p>
+      <w:pPr>
+        <w:rPr>
+          <w:sz w:val="22"/>
+          <w:szCs w:val="22"/>
+        </w:rPr>
+      </w:pPr>
+      <w:r>
+        <w:rPr>
+          <w:sz w:val="22"/>
+          <w:szCs w:val="22"/>
+        </w:rPr>
+        <w:drawing>
+          <wp:inline distT="0" distB="0" distL="0" distR="0" wp14:anchorId="300151DF" wp14:editId="4BDD63B5">
+            <wp:extent cx="1672494" cy="990600"/>
+            <wp:effectExtent l="0" t="0" r="4445" b="0"/>
+            <wp:docPr id="1264110342" name="Picture 1"/>
+            <wp:cNvGraphicFramePr>
+              <a:graphicFrameLocks xmlns:a="http://schemas.openxmlformats.org/drawingml/2006/main" noChangeAspect="1"/>
+            </wp:cNvGraphicFramePr>
+            <a:graphic xmlns:a="http://schemas.openxmlformats.org/drawingml/2006/main">
+              <a:graphicData uri="http://schemas.openxmlformats.org/drawingml/2006/picture">
+                <pic:pic xmlns:pic="http://schemas.openxmlformats.org/drawingml/2006/picture">
+                  <pic:nvPicPr>
+                    <pic:cNvPr id="1264110342" name=""/>
+                    <pic:cNvPicPr/>
+                  </pic:nvPicPr>
+                  <pic:blipFill>
+                    <a:blip r:embed="rId14"/>
+                    <a:stretch>
+                      <a:fillRect/>
+                    </a:stretch>
+                  </pic:blipFill>
+                  <pic:spPr>
+                    <a:xfrm>
+                      <a:off x="0" y="0"/>
+                      <a:ext cx="1688955" cy="1000350"/>
+                    </a:xfrm>
+                    <a:prstGeom prst="rect">
+                      <a:avLst/>
+                    </a:prstGeom>
+                  </pic:spPr>
+                </pic:pic>
+              </a:graphicData>
+            </a:graphic>
+          </wp:inline>
+        </w:drawing>
+      </w:r>
+      <w:r>
+        <w:rPr>
+          <w:noProof/>
+        </w:rPr>
+        <w:t xml:space="preserve"> </w:t>
+      </w:r>
+      <w:r>
+        <w:rPr>
+          <w:sz w:val="22"/>
+          <w:szCs w:val="22"/>
+        </w:rPr>
+        <w:drawing>
+          <wp:inline distT="0" distB="0" distL="0" distR="0" wp14:anchorId="5B0C5D25" wp14:editId="3002698A">
+            <wp:extent cx="2806700" cy="944688"/>
+            <wp:effectExtent l="0" t="0" r="0" b="8255"/>
+            <wp:docPr id="1119689212" name="Picture 1"/>
+            <wp:cNvGraphicFramePr>
+              <a:graphicFrameLocks xmlns:a="http://schemas.openxmlformats.org/drawingml/2006/main" noChangeAspect="1"/>
+            </wp:cNvGraphicFramePr>
+            <a:graphic xmlns:a="http://schemas.openxmlformats.org/drawingml/2006/main">
+              <a:graphicData uri="http://schemas.openxmlformats.org/drawingml/2006/picture">
+                <pic:pic xmlns:pic="http://schemas.openxmlformats.org/drawingml/2006/picture">
+                  <pic:nvPicPr>
+                    <pic:cNvPr id="1119689212" name=""/>
+                    <pic:cNvPicPr/>
+                  </pic:nvPicPr>
+                  <pic:blipFill>
+                    <a:blip r:embed="rId15"/>
+                    <a:stretch>
+                      <a:fillRect/>
+                    </a:stretch>
+                  </pic:blipFill>
+                  <pic:spPr>
+                    <a:xfrm>
+                      <a:off x="0" y="0"/>
+                      <a:ext cx="2830459" cy="952685"/>
+                    </a:xfrm>
+                    <a:prstGeom prst="rect">
+                      <a:avLst/>
+                    </a:prstGeom>
+                  </pic:spPr>
+                </pic:pic>
+              </a:graphicData>
+            </a:graphic>
+          </wp:inline>
+        </w:drawing>
+      </w:r>
+    </w:p>
+    <w:p>
+      <w:pPr>
+        <w:pBdr>
+          <w:bottom w:val="single" w:sz="6" w:space="1" w:color="auto"/>
+        </w:pBdr>
+        <w:rPr>
+          <w:sz w:val="22"/>
+          <w:szCs w:val="22"/>
+        </w:rPr>
+      </w:pPr>
+      <w:r>
+        <w:rPr>
+          <w:sz w:val="22"/>
+          <w:szCs w:val="22"/>
+        </w:rPr>
+        <w:lastRenderedPageBreak/>
+        <w:drawing>
+          <wp:inline distT="0" distB="0" distL="0" distR="0" wp14:anchorId="1F70EC56" wp14:editId="77ADFF46">
+            <wp:extent cx="1191928" cy="1651000"/>
+            <wp:effectExtent l="0" t="0" r="8255" b="6350"/>
+            <wp:docPr id="400539325" name="Picture 1"/>
+            <wp:cNvGraphicFramePr>
+              <a:graphicFrameLocks xmlns:a="http://schemas.openxmlformats.org/drawingml/2006/main" noChangeAspect="1"/>
+            </wp:cNvGraphicFramePr>
+            <a:graphic xmlns:a="http://schemas.openxmlformats.org/drawingml/2006/main">
+              <a:graphicData uri="http://schemas.openxmlformats.org/drawingml/2006/picture">
+                <pic:pic xmlns:pic="http://schemas.openxmlformats.org/drawingml/2006/picture">
+                  <pic:nvPicPr>
+                    <pic:cNvPr id="400539325" name=""/>
+                    <pic:cNvPicPr/>
+                  </pic:nvPicPr>
+                  <pic:blipFill>
+                    <a:blip r:embed="rId16"/>
+                    <a:stretch>
+                      <a:fillRect/>
+                    </a:stretch>
+                  </pic:blipFill>
+                  <pic:spPr>
+                    <a:xfrm>
+                      <a:off x="0" y="0"/>
+                      <a:ext cx="1196977" cy="1657994"/>
+                    </a:xfrm>
+                    <a:prstGeom prst="rect">
+                      <a:avLst/>
+                    </a:prstGeom>
+                  </pic:spPr>
+                </pic:pic>
+              </a:graphicData>
+            </a:graphic>
+          </wp:inline>
+        </w:drawing>
+      </w:r>
+    </w:p>
+    <w:p>
+      <w:pPr>
+        <w:pBdr>
+          <w:bottom w:val="single" w:sz="6" w:space="1" w:color="auto"/>
+        </w:pBdr>
+        <w:rPr>
+          <w:sz w:val="22"/>
+          <w:szCs w:val="22"/>
+        </w:rPr>
+      </w:pPr>
+    </w:p>
+    <w:p>
+      <w:pPr>
+        <w:rPr>
+          <w:b/>
+          <w:bCs/>
+          <w:sz w:val="28"/>
+          <w:szCs w:val="28"/>
+        </w:rPr>
+      </w:pPr>
+      <w:r>
+        <w:rPr>
+          <w:b/>
+          <w:bCs/>
+          <w:sz w:val="28"/>
+          <w:szCs w:val="28"/>
+        </w:rPr>
+        <w:t>Test Covered:</w:t>
+      </w:r>
+    </w:p>
+    <w:p>
+      <w:pPr>
+        <w:rPr>
+          <w:sz w:val="28"/>
+          <w:szCs w:val="28"/>
+        </w:rPr>
+      </w:pPr>
+      <w:r>
+        <w:rPr>
+          <w:sz w:val="28"/>
+          <w:szCs w:val="28"/>
+        </w:rPr>
+        <w:t xml:space="preserve">Test </w:t>
+      </w:r>
+      <w:proofErr w:type="gramStart"/>
+      <w:r>
+        <w:rPr>
+          <w:sz w:val="28"/>
+          <w:szCs w:val="28"/>
+        </w:rPr>
+        <w:t>1 :</w:t>
+      </w:r>
+      <w:proofErr w:type="gramEnd"/>
+      <w:r>
+        <w:rPr>
+          <w:rFonts w:ascii="Consolas" w:eastAsia="Times New Roman" w:hAnsi="Consolas" w:cs="Times New Roman"/>
+          <w:color w:val="A5D6FF"/>
+          <w:kern w:val="0"/>
+          <w:sz w:val="21"/>
+          <w:szCs w:val="21"/>
+          <w:lang w:eastAsia="en-IN"/>
+          <w14:ligatures w14:val="none"/>
+        </w:rPr>
+        <w:t xml:space="preserve"> </w:t>
+      </w:r>
+      <w:r>
+        <w:rPr>
+          <w:sz w:val="28"/>
+          <w:szCs w:val="28"/>
+        </w:rPr>
+        <w:t>verify the badge is showing when searched</w:t>
+      </w:r>
+      <w:r>
+        <w:rPr>
+          <w:b/>
+          <w:bCs/>
+          <w:sz w:val="28"/>
+          <w:szCs w:val="28"/>
+        </w:rPr>
+        <w:t>= Passed</w:t>
+      </w:r>
+    </w:p>
+    <w:p>
+      <w:pPr>
+        <w:rPr>
+          <w:b/>
+          <w:bCs/>
+          <w:sz w:val="28"/>
+          <w:szCs w:val="28"/>
+        </w:rPr>
+      </w:pPr>
+      <w:r>
+        <w:rPr>
+          <w:sz w:val="28"/>
+          <w:szCs w:val="28"/>
+        </w:rPr>
+        <w:t xml:space="preserve">Test </w:t>
+      </w:r>
+      <w:proofErr w:type="gramStart"/>
+      <w:r>
+        <w:rPr>
+          <w:sz w:val="28"/>
+          <w:szCs w:val="28"/>
+        </w:rPr>
+        <w:t>2 :</w:t>
+      </w:r>
+      <w:proofErr w:type="gramEnd"/>
+      <w:r>
+        <w:rPr>
+          <w:rFonts w:ascii="Consolas" w:eastAsia="Times New Roman" w:hAnsi="Consolas" w:cs="Times New Roman"/>
+          <w:color w:val="A5D6FF"/>
+          <w:kern w:val="0"/>
+          <w:sz w:val="21"/>
+          <w:szCs w:val="21"/>
+          <w:lang w:eastAsia="en-IN"/>
+          <w14:ligatures w14:val="none"/>
+        </w:rPr>
+        <w:t xml:space="preserve"> </w:t>
+      </w:r>
+      <w:r>
+        <w:rPr>
+          <w:sz w:val="28"/>
+          <w:szCs w:val="28"/>
+        </w:rPr>
+        <w:t>Consumer pact creation</w:t>
+      </w:r>
+      <w:r>
+        <w:rPr>
+          <w:b/>
+          <w:bCs/>
+          <w:sz w:val="28"/>
+          <w:szCs w:val="28"/>
+        </w:rPr>
+        <w:t>= Passed</w:t>
+      </w:r>
+    </w:p>
+    <w:p>
+      <w:pPr>
+        <w:rPr>
+          <w:b/>
+          <w:bCs/>
+          <w:sz w:val="28"/>
+          <w:szCs w:val="28"/>
+        </w:rPr>
+      </w:pPr>
+      <w:r>
+        <w:rPr>
+          <w:sz w:val="28"/>
+          <w:szCs w:val="28"/>
+        </w:rPr>
+        <w:t xml:space="preserve">Test </w:t>
+      </w:r>
+      <w:proofErr w:type="gramStart"/>
+      <w:r>
+        <w:rPr>
+          <w:sz w:val="28"/>
+          <w:szCs w:val="28"/>
+        </w:rPr>
+        <w:t>3</w:t>
+      </w:r>
+      <w:r>
+        <w:rPr>
+          <w:sz w:val="28"/>
+          <w:szCs w:val="28"/>
+        </w:rPr>
+        <w:t xml:space="preserve"> :</w:t>
+      </w:r>
+      <w:proofErr w:type="gramEnd"/>
+      <w:r>
+        <w:rPr>
+          <w:rFonts w:ascii="Consolas" w:eastAsia="Times New Roman" w:hAnsi="Consolas" w:cs="Times New Roman"/>
+          <w:color w:val="A5D6FF"/>
+          <w:kern w:val="0"/>
+          <w:sz w:val="21"/>
+          <w:szCs w:val="21"/>
+          <w:lang w:eastAsia="en-IN"/>
+          <w14:ligatures w14:val="none"/>
+        </w:rPr>
+        <w:t xml:space="preserve"> </w:t>
+      </w:r>
+      <w:r>
+        <w:rPr>
+          <w:sz w:val="28"/>
+          <w:szCs w:val="28"/>
+        </w:rPr>
+        <w:t>Consumer added pact to the broker</w:t>
+      </w:r>
+      <w:r>
+        <w:rPr>
+          <w:b/>
+          <w:bCs/>
+          <w:sz w:val="28"/>
+          <w:szCs w:val="28"/>
+        </w:rPr>
+        <w:t>= Passed</w:t>
+      </w:r>
+    </w:p>
+    <w:p>
+      <w:pPr>
+        <w:rPr>
+          <w:sz w:val="28"/>
+          <w:szCs w:val="28"/>
+        </w:rPr>
+      </w:pPr>
+      <w:r>
+        <w:rPr>
+          <w:sz w:val="28"/>
+          <w:szCs w:val="28"/>
+        </w:rPr>
+        <w:t xml:space="preserve">Test </w:t>
+      </w:r>
+      <w:proofErr w:type="gramStart"/>
+      <w:r>
+        <w:rPr>
+          <w:sz w:val="28"/>
+          <w:szCs w:val="28"/>
+        </w:rPr>
+        <w:t>4</w:t>
+      </w:r>
+      <w:r>
+        <w:rPr>
+          <w:sz w:val="28"/>
+          <w:szCs w:val="28"/>
+        </w:rPr>
+        <w:t xml:space="preserve"> :</w:t>
+      </w:r>
+      <w:proofErr w:type="gramEnd"/>
+      <w:r>
+        <w:rPr>
+          <w:rFonts w:ascii="Consolas" w:eastAsia="Times New Roman" w:hAnsi="Consolas" w:cs="Times New Roman"/>
+          <w:color w:val="A5D6FF"/>
+          <w:kern w:val="0"/>
+          <w:sz w:val="21"/>
+          <w:szCs w:val="21"/>
+          <w:lang w:eastAsia="en-IN"/>
+          <w14:ligatures w14:val="none"/>
+        </w:rPr>
+        <w:t xml:space="preserve"> </w:t>
+      </w:r>
+      <w:r>
+        <w:rPr>
+          <w:sz w:val="28"/>
+          <w:szCs w:val="28"/>
+        </w:rPr>
+        <w:t>Producer verified the pact</w:t>
+      </w:r>
+      <w:r>
+        <w:rPr>
+          <w:b/>
+          <w:bCs/>
+          <w:sz w:val="28"/>
+          <w:szCs w:val="28"/>
+        </w:rPr>
+        <w:t>= Passed</w:t>
+      </w:r>
+    </w:p>
+    <w:p>
+      <w:pPr>
+        <w:rPr>
+          <w:sz w:val="28"/>
+          <w:szCs w:val="28"/>
+        </w:rPr>
+      </w:pPr>
+      <w:r>
+        <w:rPr>
+          <w:sz w:val="28"/>
+          <w:szCs w:val="28"/>
+        </w:rPr>
+        <w:t xml:space="preserve">Test </w:t>
+      </w:r>
+      <w:proofErr w:type="gramStart"/>
+      <w:r>
+        <w:rPr>
+          <w:sz w:val="28"/>
+          <w:szCs w:val="28"/>
+        </w:rPr>
+        <w:t>5</w:t>
+      </w:r>
+      <w:r>
+        <w:rPr>
+          <w:sz w:val="28"/>
+          <w:szCs w:val="28"/>
+        </w:rPr>
+        <w:t xml:space="preserve"> :</w:t>
+      </w:r>
+      <w:proofErr w:type="gramEnd"/>
+      <w:r>
+        <w:rPr>
+          <w:rFonts w:ascii="Consolas" w:eastAsia="Times New Roman" w:hAnsi="Consolas" w:cs="Times New Roman"/>
+          <w:color w:val="A5D6FF"/>
+          <w:kern w:val="0"/>
+          <w:sz w:val="21"/>
+          <w:szCs w:val="21"/>
+          <w:lang w:eastAsia="en-IN"/>
+          <w14:ligatures w14:val="none"/>
+        </w:rPr>
+        <w:t xml:space="preserve"> </w:t>
+      </w:r>
+      <w:r>
+        <w:rPr>
+          <w:sz w:val="28"/>
+          <w:szCs w:val="28"/>
+        </w:rPr>
+        <w:t>Producer added the result to the broker</w:t>
+      </w:r>
+      <w:r>
+        <w:rPr>
+          <w:b/>
+          <w:bCs/>
+          <w:sz w:val="28"/>
+          <w:szCs w:val="28"/>
+        </w:rPr>
+        <w:t>= Passed</w:t>
+      </w:r>
+    </w:p>
+    <w:p>
+      <w:pPr>
+        <w:rPr>
+          <w:sz w:val="28"/>
+          <w:szCs w:val="28"/>
+        </w:rPr>
+      </w:pPr>
+      <w:r>
+        <w:rPr>
+          <w:sz w:val="28"/>
+          <w:szCs w:val="28"/>
+        </w:rPr>
+        <w:t xml:space="preserve">Test </w:t>
+      </w:r>
+      <w:proofErr w:type="gramStart"/>
+      <w:r>
+        <w:rPr>
+          <w:sz w:val="28"/>
+          <w:szCs w:val="28"/>
+        </w:rPr>
+        <w:t>6</w:t>
+      </w:r>
+      <w:r>
+        <w:rPr>
+          <w:sz w:val="28"/>
+          <w:szCs w:val="28"/>
+        </w:rPr>
+        <w:t xml:space="preserve"> :</w:t>
+      </w:r>
+      <w:proofErr w:type="gramEnd"/>
+      <w:r>
+        <w:rPr>
+          <w:rFonts w:ascii="Consolas" w:eastAsia="Times New Roman" w:hAnsi="Consolas" w:cs="Times New Roman"/>
+          <w:color w:val="A5D6FF"/>
+          <w:kern w:val="0"/>
+          <w:sz w:val="21"/>
+          <w:szCs w:val="21"/>
+          <w:lang w:eastAsia="en-IN"/>
+          <w14:ligatures w14:val="none"/>
+        </w:rPr>
+        <w:t xml:space="preserve"> </w:t>
+      </w:r>
+      <w:r>
+        <w:rPr>
+          <w:sz w:val="28"/>
+          <w:szCs w:val="28"/>
+        </w:rPr>
+        <w:t>Can I deploy is run by consumer</w:t>
+      </w:r>
+      <w:r>
+        <w:rPr>
+          <w:b/>
+          <w:bCs/>
+          <w:sz w:val="28"/>
+          <w:szCs w:val="28"/>
+        </w:rPr>
+        <w:t>= Passed</w:t>
+      </w:r>
+    </w:p>
+    <w:p>
+      <w:pPr>
+        <w:pBdr>
+          <w:bottom w:val="single" w:sz="6" w:space="1" w:color="auto"/>
+        </w:pBdr>
+        <w:rPr>
+          <w:sz w:val="28"/>
+          <w:szCs w:val="28"/>
+        </w:rPr>
+      </w:pPr>
+    </w:p>
+    <w:p>
+      <w:pPr>
+        <w:rPr>
+          <w:b/>
+          <w:bCs/>
+          <w:sz w:val="28"/>
+          <w:szCs w:val="28"/>
+        </w:rPr>
+      </w:pPr>
+      <w:proofErr w:type="gramStart"/>
+      <w:r>
+        <w:rPr>
+          <w:b/>
+          <w:bCs/>
+          <w:sz w:val="28"/>
+          <w:szCs w:val="28"/>
+        </w:rPr>
+        <w:t>Evidences</w:t>
+      </w:r>
+      <w:proofErr w:type="gramEnd"/>
+      <w:r>
+        <w:rPr>
+          <w:b/>
+          <w:bCs/>
+          <w:sz w:val="28"/>
+          <w:szCs w:val="28"/>
+        </w:rPr>
+        <w:t>:</w:t>
+      </w:r>
+    </w:p>
+    <w:p>
+      <w:pPr>
+        <w:rPr>
+          <w:sz w:val="22"/>
+          <w:szCs w:val="22"/>
+        </w:rPr>
+      </w:pPr>
+      <w:proofErr w:type="spellStart"/>
+      <w:r>
+        <w:rPr>
+          <w:sz w:val="22"/>
+          <w:szCs w:val="22"/>
+        </w:rPr>
+        <w:t>Consumer.yml</w:t>
+      </w:r>
+      <w:proofErr w:type="spellEnd"/>
+      <w:r>
+        <w:rPr>
+          <w:sz w:val="22"/>
+          <w:szCs w:val="22"/>
+        </w:rPr>
+        <w:t xml:space="preserve"> </w:t>
+      </w:r>
+      <w:proofErr w:type="spellStart"/>
+      <w:r>
+        <w:rPr>
+          <w:sz w:val="22"/>
+          <w:szCs w:val="22"/>
+        </w:rPr>
+        <w:t>runned</w:t>
+      </w:r>
+      <w:proofErr w:type="spellEnd"/>
+    </w:p>
+    <w:p>
+      <w:pPr>
+        <w:rPr>
+          <w:sz w:val="22"/>
+          <w:szCs w:val="22"/>
+        </w:rPr>
+      </w:pPr>
+      <w:r>
+        <w:rPr>
+          <w:sz w:val="22"/>
+          <w:szCs w:val="22"/>
+        </w:rPr>
+        <w:drawing>
+          <wp:inline distT="0" distB="0" distL="0" distR="0" wp14:anchorId="3F0688CC" wp14:editId="0A955D5C">
+            <wp:extent cx="5731510" cy="3149600"/>
+            <wp:effectExtent l="0" t="0" r="2540" b="0"/>
+            <wp:docPr id="1646998832" name="Picture 1"/>
+            <wp:cNvGraphicFramePr>
+              <a:graphicFrameLocks xmlns:a="http://schemas.openxmlformats.org/drawingml/2006/main" noChangeAspect="1"/>
+            </wp:cNvGraphicFramePr>
+            <a:graphic xmlns:a="http://schemas.openxmlformats.org/drawingml/2006/main">
+              <a:graphicData uri="http://schemas.openxmlformats.org/drawingml/2006/picture">
+                <pic:pic xmlns:pic="http://schemas.openxmlformats.org/drawingml/2006/picture">
+                  <pic:nvPicPr>
+                    <pic:cNvPr id="1646998832" name=""/>
+                    <pic:cNvPicPr/>
+                  </pic:nvPicPr>
+                  <pic:blipFill>
+                    <a:blip r:embed="rId17"/>
+                    <a:stretch>
+                      <a:fillRect/>
+                    </a:stretch>
+                  </pic:blipFill>
+                  <pic:spPr>
+                    <a:xfrm>
+                      <a:off x="0" y="0"/>
+                      <a:ext cx="5731510" cy="3149600"/>
+                    </a:xfrm>
+                    <a:prstGeom prst="rect">
+                      <a:avLst/>
+                    </a:prstGeom>
+                  </pic:spPr>
+                </pic:pic>
+              </a:graphicData>
+            </a:graphic>
+          </wp:inline>
+        </w:drawing>
+      </w:r>
+    </w:p>
+    <w:p>
+      <w:pPr>
+        <w:rPr>
+          <w:sz w:val="22"/>
+          <w:szCs w:val="22"/>
+        </w:rPr>
+      </w:pPr>
+      <w:proofErr w:type="spellStart"/>
+      <w:r>
+        <w:rPr>
+          <w:sz w:val="22"/>
+          <w:szCs w:val="22"/>
+        </w:rPr>
+        <w:lastRenderedPageBreak/>
+        <w:t>Producer</w:t>
+      </w:r>
+      <w:r>
+        <w:rPr>
+          <w:sz w:val="22"/>
+          <w:szCs w:val="22"/>
+        </w:rPr>
+        <w:t>.yml</w:t>
+      </w:r>
+      <w:proofErr w:type="spellEnd"/>
+      <w:r>
+        <w:rPr>
+          <w:sz w:val="22"/>
+          <w:szCs w:val="22"/>
+        </w:rPr>
+        <w:t xml:space="preserve"> </w:t>
+      </w:r>
+      <w:proofErr w:type="spellStart"/>
+      <w:r>
+        <w:rPr>
+          <w:sz w:val="22"/>
+          <w:szCs w:val="22"/>
+        </w:rPr>
+        <w:t>runned</w:t>
+      </w:r>
+      <w:proofErr w:type="spellEnd"/>
+    </w:p>
+    <w:p>
+      <w:pPr>
+        <w:rPr>
+          <w:sz w:val="22"/>
+          <w:szCs w:val="22"/>
+        </w:rPr>
+      </w:pPr>
+      <w:r>
+        <w:rPr>
+          <w:sz w:val="22"/>
+          <w:szCs w:val="22"/>
+        </w:rPr>
+        <w:drawing>
+          <wp:inline distT="0" distB="0" distL="0" distR="0" wp14:anchorId="24136002" wp14:editId="5C6A4E44">
+            <wp:extent cx="5731510" cy="2832100"/>
+            <wp:effectExtent l="0" t="0" r="2540" b="6350"/>
+            <wp:docPr id="488257932" name="Picture 1"/>
+            <wp:cNvGraphicFramePr>
+              <a:graphicFrameLocks xmlns:a="http://schemas.openxmlformats.org/drawingml/2006/main" noChangeAspect="1"/>
+            </wp:cNvGraphicFramePr>
+            <a:graphic xmlns:a="http://schemas.openxmlformats.org/drawingml/2006/main">
+              <a:graphicData uri="http://schemas.openxmlformats.org/drawingml/2006/picture">
+                <pic:pic xmlns:pic="http://schemas.openxmlformats.org/drawingml/2006/picture">
+                  <pic:nvPicPr>
+                    <pic:cNvPr id="488257932" name=""/>
+                    <pic:cNvPicPr/>
+                  </pic:nvPicPr>
+                  <pic:blipFill>
+                    <a:blip r:embed="rId18"/>
+                    <a:stretch>
+                      <a:fillRect/>
+                    </a:stretch>
+                  </pic:blipFill>
+                  <pic:spPr>
+                    <a:xfrm>
+                      <a:off x="0" y="0"/>
+                      <a:ext cx="5731510" cy="2832100"/>
+                    </a:xfrm>
+                    <a:prstGeom prst="rect">
+                      <a:avLst/>
+                    </a:prstGeom>
+                  </pic:spPr>
+                </pic:pic>
+              </a:graphicData>
+            </a:graphic>
+          </wp:inline>
+        </w:drawing>
+      </w:r>
+    </w:p>
+    <w:p>
+      <w:pPr>
+        <w:rPr>
+          <w:sz w:val="22"/>
+          <w:szCs w:val="22"/>
+        </w:rPr>
+      </w:pPr>
+    </w:p>
+    <w:p>
+      <w:pPr>
+        <w:rPr>
+          <w:sz w:val="22"/>
+          <w:szCs w:val="22"/>
+        </w:rPr>
+      </w:pPr>
+      <w:r>
+        <w:rPr>
+          <w:sz w:val="22"/>
+          <w:szCs w:val="22"/>
+        </w:rPr>
+        <w:t>Selenide code run</w:t>
+      </w:r>
+    </w:p>
+    <w:p>
+      <w:pPr>
+        <w:rPr>
+          <w:sz w:val="22"/>
+          <w:szCs w:val="22"/>
+        </w:rPr>
+      </w:pPr>
+      <w:r>
+        <w:rPr>
+          <w:sz w:val="22"/>
+          <w:szCs w:val="22"/>
+        </w:rPr>
+        <w:drawing>
+          <wp:inline distT="0" distB="0" distL="0" distR="0" wp14:anchorId="13E4D675" wp14:editId="140E1C92">
+            <wp:extent cx="5731510" cy="2854960"/>
+            <wp:effectExtent l="0" t="0" r="2540" b="2540"/>
+            <wp:docPr id="1577702252" name="Picture 1"/>
+            <wp:cNvGraphicFramePr>
+              <a:graphicFrameLocks xmlns:a="http://schemas.openxmlformats.org/drawingml/2006/main" noChangeAspect="1"/>
+            </wp:cNvGraphicFramePr>
+            <a:graphic xmlns:a="http://schemas.openxmlformats.org/drawingml/2006/main">
+              <a:graphicData uri="http://schemas.openxmlformats.org/drawingml/2006/picture">
+                <pic:pic xmlns:pic="http://schemas.openxmlformats.org/drawingml/2006/picture">
+                  <pic:nvPicPr>
+                    <pic:cNvPr id="1577702252" name=""/>
+                    <pic:cNvPicPr/>
+                  </pic:nvPicPr>
+                  <pic:blipFill>
+                    <a:blip r:embed="rId19"/>
+                    <a:stretch>
+                      <a:fillRect/>
+                    </a:stretch>
+                  </pic:blipFill>
+                  <pic:spPr>
+                    <a:xfrm>
+                      <a:off x="0" y="0"/>
+                      <a:ext cx="5731510" cy="2854960"/>
+                    </a:xfrm>
+                    <a:prstGeom prst="rect">
+                      <a:avLst/>
+                    </a:prstGeom>
+                  </pic:spPr>
+                </pic:pic>
+              </a:graphicData>
+            </a:graphic>
+          </wp:inline>
+        </w:drawing>
+      </w:r>
+    </w:p>
+    <w:p>
+      <w:pPr>
+        <w:pBdr>
+          <w:bottom w:val="single" w:sz="6" w:space="1" w:color="auto"/>
+        </w:pBdr>
+        <w:rPr>
+          <w:sz w:val="22"/>
+          <w:szCs w:val="22"/>
+        </w:rPr>
+      </w:pPr>
+    </w:p>
+    <w:p>
+      <w:pPr>
+        <w:rPr>
+          <w:b/>
+          <w:bCs/>
+          <w:sz w:val="28"/>
+          <w:szCs w:val="28"/>
+        </w:rPr>
+      </w:pPr>
+      <w:r>
+        <w:rPr>
+          <w:b/>
+          <w:bCs/>
+          <w:sz w:val="28"/>
+          <w:szCs w:val="28"/>
+        </w:rPr>
+        <w:t>Conclusion:</w:t>
+      </w:r>
+    </w:p>
+    <w:p>
+      <w:pPr>
+        <w:rPr>
+          <w:b/>
+          <w:bCs/>
+          <w:sz w:val="28"/>
+          <w:szCs w:val="28"/>
+        </w:rPr>
+      </w:pPr>
+      <w:r>
+        <w:rPr>
+          <w:b/>
+          <w:bCs/>
+          <w:sz w:val="28"/>
+          <w:szCs w:val="28"/>
+        </w:rPr>
+        <w:t xml:space="preserve">The test </w:t>
+      </w:r>
+      <w:proofErr w:type="gramStart"/>
+      <w:r>
+        <w:rPr>
+          <w:b/>
+          <w:bCs/>
+          <w:sz w:val="28"/>
+          <w:szCs w:val="28"/>
+        </w:rPr>
+        <w:t>are</w:t>
+      </w:r>
+      <w:proofErr w:type="gramEnd"/>
+      <w:r>
+        <w:rPr>
+          <w:b/>
+          <w:bCs/>
+          <w:sz w:val="28"/>
+          <w:szCs w:val="28"/>
+        </w:rPr>
+        <w:t xml:space="preserve"> passing successfully</w:t>
+      </w:r>
+    </w:p>
+    <w:p>
+      <w:pPr>
+        <w:rPr>
+          <w:sz w:val="22"/>
+          <w:szCs w:val="22"/>
+        </w:rPr>
+      </w:pPr>
+    </w:p>
+    <w:p/>
+    <w:p/>
+    <w:p/>
     <w:p/>
     <w:sectPr>
       <w:pgSz w:w="11906" w:h="16838"/>
@@ -396,6 +4282,95 @@
 <file path=word/numbering.xml><?xml version="1.0" encoding="utf-8"?>
 <w:numbering xmlns:wpc="http://schemas.microsoft.com/office/word/2010/wordprocessingCanvas" xmlns:cx="http://schemas.microsoft.com/office/drawing/2014/chartex" xmlns:cx1="http://schemas.microsoft.com/office/drawing/2015/9/8/chartex" xmlns:cx2="http://schemas.microsoft.com/office/drawing/2015/10/21/chartex" xmlns:cx3="http://schemas.microsoft.com/office/drawing/2016/5/9/chartex" xmlns:cx4="http://schemas.microsoft.com/office/drawing/2016/5/10/chartex" xmlns:cx5="http://schemas.microsoft.com/office/drawing/2016/5/11/chartex" xmlns:cx6="http://schemas.microsoft.com/office/drawing/2016/5/12/chartex" xmlns:cx7="http://schemas.microsoft.com/office/drawing/2016/5/13/chartex" xmlns:cx8="http://schemas.microsoft.com/office/drawing/2016/5/14/chartex" xmlns:mc="http://schemas.openxmlformats.org/markup-compatibility/2006" xmlns:aink="http://schemas.microsoft.com/office/drawing/2016/ink" xmlns:am3d="http://schemas.microsoft.com/office/drawing/2017/model3d" xmlns:o="urn:schemas-microsoft-com:office:office" xmlns:oel="http://schemas.microsoft.com/office/2019/extlst" xmlns:r="http://schemas.openxmlformats.org/officeDocument/2006/relationships" xmlns:m="http://schemas.openxmlformats.org/officeDocument/2006/math" xmlns:v="urn:schemas-microsoft-com:vml" xmlns:wp14="http://schemas.microsoft.com/office/word/2010/wordprocessingDrawing" xmlns:wp="http://schemas.openxmlformats.org/drawingml/2006/wordprocessingDrawing" xmlns:w10="urn:schemas-microsoft-com:office:word" xmlns:w="http://schemas.openxmlformats.org/wordprocessingml/2006/main" xmlns:w14="http://schemas.microsoft.com/office/word/2010/wordml" xmlns:w15="http://schemas.microsoft.com/office/word/2012/wordml" xmlns:w16cex="http://schemas.microsoft.com/office/word/2018/wordml/cex" xmlns:w16cid="http://schemas.microsoft.com/office/word/2016/wordml/cid" xmlns:w16="http://schemas.microsoft.com/office/word/2018/wordml" xmlns:w16du="http://schemas.microsoft.com/office/word/2023/wordml/word16du" xmlns:w16sdtdh="http://schemas.microsoft.com/office/word/2020/wordml/sdtdatahash" xmlns:w16sdtfl="http://schemas.microsoft.com/office/word/2024/wordml/sdtformatlock" xmlns:w16se="http://schemas.microsoft.com/office/word/2015/wordml/symex" xmlns:wpg="http://schemas.microsoft.com/office/word/2010/wordprocessingGroup" xmlns:wpi="http://schemas.microsoft.com/office/word/2010/wordprocessingInk" xmlns:wne="http://schemas.microsoft.com/office/word/2006/wordml" xmlns:wps="http://schemas.microsoft.com/office/word/2010/wordprocessingShape" mc:Ignorable="w14 w15 w16se w16cid w16 w16cex w16sdtdh w16sdtfl w16du wp14">
   <w:abstractNum w:abstractNumId="0" w15:restartNumberingAfterBreak="0">
+    <w:nsid w:val="03A46C65"/>
+    <w:multiLevelType w:val="hybridMultilevel"/>
+    <w:tmpl w:val="E1DE8A7A"/>
+    <w:lvl w:ilvl="0" w:tplc="FFFFFFFF">
+      <w:start w:val="1"/>
+      <w:numFmt w:val="decimal"/>
+      <w:lvlText w:val="%1."/>
+      <w:lvlJc w:val="left"/>
+      <w:pPr>
+        <w:ind w:left="720" w:hanging="360"/>
+      </w:pPr>
+      <w:rPr>
+        <w:rFonts w:hint="default"/>
+      </w:rPr>
+    </w:lvl>
+    <w:lvl w:ilvl="1" w:tplc="FFFFFFFF" w:tentative="1">
+      <w:start w:val="1"/>
+      <w:numFmt w:val="lowerLetter"/>
+      <w:lvlText w:val="%2."/>
+      <w:lvlJc w:val="left"/>
+      <w:pPr>
+        <w:ind w:left="1440" w:hanging="360"/>
+      </w:pPr>
+    </w:lvl>
+    <w:lvl w:ilvl="2" w:tplc="FFFFFFFF" w:tentative="1">
+      <w:start w:val="1"/>
+      <w:numFmt w:val="lowerRoman"/>
+      <w:lvlText w:val="%3."/>
+      <w:lvlJc w:val="right"/>
+      <w:pPr>
+        <w:ind w:left="2160" w:hanging="180"/>
+      </w:pPr>
+    </w:lvl>
+    <w:lvl w:ilvl="3" w:tplc="FFFFFFFF" w:tentative="1">
+      <w:start w:val="1"/>
+      <w:numFmt w:val="decimal"/>
+      <w:lvlText w:val="%4."/>
+      <w:lvlJc w:val="left"/>
+      <w:pPr>
+        <w:ind w:left="2880" w:hanging="360"/>
+      </w:pPr>
+    </w:lvl>
+    <w:lvl w:ilvl="4" w:tplc="FFFFFFFF" w:tentative="1">
+      <w:start w:val="1"/>
+      <w:numFmt w:val="lowerLetter"/>
+      <w:lvlText w:val="%5."/>
+      <w:lvlJc w:val="left"/>
+      <w:pPr>
+        <w:ind w:left="3600" w:hanging="360"/>
+      </w:pPr>
+    </w:lvl>
+    <w:lvl w:ilvl="5" w:tplc="FFFFFFFF" w:tentative="1">
+      <w:start w:val="1"/>
+      <w:numFmt w:val="lowerRoman"/>
+      <w:lvlText w:val="%6."/>
+      <w:lvlJc w:val="right"/>
+      <w:pPr>
+        <w:ind w:left="4320" w:hanging="180"/>
+      </w:pPr>
+    </w:lvl>
+    <w:lvl w:ilvl="6" w:tplc="FFFFFFFF" w:tentative="1">
+      <w:start w:val="1"/>
+      <w:numFmt w:val="decimal"/>
+      <w:lvlText w:val="%7."/>
+      <w:lvlJc w:val="left"/>
+      <w:pPr>
+        <w:ind w:left="5040" w:hanging="360"/>
+      </w:pPr>
+    </w:lvl>
+    <w:lvl w:ilvl="7" w:tplc="FFFFFFFF" w:tentative="1">
+      <w:start w:val="1"/>
+      <w:numFmt w:val="lowerLetter"/>
+      <w:lvlText w:val="%8."/>
+      <w:lvlJc w:val="left"/>
+      <w:pPr>
+        <w:ind w:left="5760" w:hanging="360"/>
+      </w:pPr>
+    </w:lvl>
+    <w:lvl w:ilvl="8" w:tplc="FFFFFFFF" w:tentative="1">
+      <w:start w:val="1"/>
+      <w:numFmt w:val="lowerRoman"/>
+      <w:lvlText w:val="%9."/>
+      <w:lvlJc w:val="right"/>
+      <w:pPr>
+        <w:ind w:left="6480" w:hanging="180"/>
+      </w:pPr>
+    </w:lvl>
+  </w:abstractNum>
+  <w:abstractNum w:abstractNumId="1" w15:restartNumberingAfterBreak="0">
     <w:nsid w:val="0EAD3147"/>
     <w:multiLevelType w:val="hybridMultilevel"/>
     <w:tmpl w:val="F176E17C"/>
@@ -484,7 +4459,7 @@
       </w:pPr>
     </w:lvl>
   </w:abstractNum>
-  <w:abstractNum w:abstractNumId="1" w15:restartNumberingAfterBreak="0">
+  <w:abstractNum w:abstractNumId="2" w15:restartNumberingAfterBreak="0">
     <w:nsid w:val="0F9C151E"/>
     <w:multiLevelType w:val="hybridMultilevel"/>
     <w:tmpl w:val="E1DE8A7A"/>
@@ -573,7 +4548,97 @@
       </w:pPr>
     </w:lvl>
   </w:abstractNum>
-  <w:abstractNum w:abstractNumId="2" w15:restartNumberingAfterBreak="0">
+  <w:abstractNum w:abstractNumId="3" w15:restartNumberingAfterBreak="0">
+    <w:nsid w:val="279A051A"/>
+    <w:multiLevelType w:val="hybridMultilevel"/>
+    <w:tmpl w:val="4E300EA2"/>
+    <w:lvl w:ilvl="0" w:tplc="4009000F">
+      <w:start w:val="1"/>
+      <w:numFmt w:val="decimal"/>
+      <w:lvlText w:val="%1."/>
+      <w:lvlJc w:val="left"/>
+      <w:pPr>
+        <w:ind w:left="720" w:hanging="360"/>
+      </w:pPr>
+      <w:rPr>
+        <w:rFonts w:hint="default"/>
+        <w:b w:val="0"/>
+      </w:rPr>
+    </w:lvl>
+    <w:lvl w:ilvl="1" w:tplc="40090019" w:tentative="1">
+      <w:start w:val="1"/>
+      <w:numFmt w:val="lowerLetter"/>
+      <w:lvlText w:val="%2."/>
+      <w:lvlJc w:val="left"/>
+      <w:pPr>
+        <w:ind w:left="1440" w:hanging="360"/>
+      </w:pPr>
+    </w:lvl>
+    <w:lvl w:ilvl="2" w:tplc="4009001B" w:tentative="1">
+      <w:start w:val="1"/>
+      <w:numFmt w:val="lowerRoman"/>
+      <w:lvlText w:val="%3."/>
+      <w:lvlJc w:val="right"/>
+      <w:pPr>
+        <w:ind w:left="2160" w:hanging="180"/>
+      </w:pPr>
+    </w:lvl>
+    <w:lvl w:ilvl="3" w:tplc="4009000F" w:tentative="1">
+      <w:start w:val="1"/>
+      <w:numFmt w:val="decimal"/>
+      <w:lvlText w:val="%4."/>
+      <w:lvlJc w:val="left"/>
+      <w:pPr>
+        <w:ind w:left="2880" w:hanging="360"/>
+      </w:pPr>
+    </w:lvl>
+    <w:lvl w:ilvl="4" w:tplc="40090019" w:tentative="1">
+      <w:start w:val="1"/>
+      <w:numFmt w:val="lowerLetter"/>
+      <w:lvlText w:val="%5."/>
+      <w:lvlJc w:val="left"/>
+      <w:pPr>
+        <w:ind w:left="3600" w:hanging="360"/>
+      </w:pPr>
+    </w:lvl>
+    <w:lvl w:ilvl="5" w:tplc="4009001B" w:tentative="1">
+      <w:start w:val="1"/>
+      <w:numFmt w:val="lowerRoman"/>
+      <w:lvlText w:val="%6."/>
+      <w:lvlJc w:val="right"/>
+      <w:pPr>
+        <w:ind w:left="4320" w:hanging="180"/>
+      </w:pPr>
+    </w:lvl>
+    <w:lvl w:ilvl="6" w:tplc="4009000F" w:tentative="1">
+      <w:start w:val="1"/>
+      <w:numFmt w:val="decimal"/>
+      <w:lvlText w:val="%7."/>
+      <w:lvlJc w:val="left"/>
+      <w:pPr>
+        <w:ind w:left="5040" w:hanging="360"/>
+      </w:pPr>
+    </w:lvl>
+    <w:lvl w:ilvl="7" w:tplc="40090019" w:tentative="1">
+      <w:start w:val="1"/>
+      <w:numFmt w:val="lowerLetter"/>
+      <w:lvlText w:val="%8."/>
+      <w:lvlJc w:val="left"/>
+      <w:pPr>
+        <w:ind w:left="5760" w:hanging="360"/>
+      </w:pPr>
+    </w:lvl>
+    <w:lvl w:ilvl="8" w:tplc="4009001B" w:tentative="1">
+      <w:start w:val="1"/>
+      <w:numFmt w:val="lowerRoman"/>
+      <w:lvlText w:val="%9."/>
+      <w:lvlJc w:val="right"/>
+      <w:pPr>
+        <w:ind w:left="6480" w:hanging="180"/>
+      </w:pPr>
+    </w:lvl>
+  </w:abstractNum>
+  <w:abstractNum w:abstractNumId="4" w15:restartNumberingAfterBreak="0">
     <w:nsid w:val="296E0DD5"/>
     <w:multiLevelType w:val="hybridMultilevel"/>
     <w:tmpl w:val="E1DE8A7A"/>
@@ -662,7 +4727,7 @@
       </w:pPr>
     </w:lvl>
   </w:abstractNum>
-  <w:abstractNum w:abstractNumId="3" w15:restartNumberingAfterBreak="0">
+  <w:abstractNum w:abstractNumId="5" w15:restartNumberingAfterBreak="0">
     <w:nsid w:val="472C3088"/>
     <w:multiLevelType w:val="hybridMultilevel"/>
     <w:tmpl w:val="F176E17C"/>
@@ -751,7 +4816,98 @@
       </w:pPr>
     </w:lvl>
   </w:abstractNum>
-  <w:abstractNum w:abstractNumId="4" w15:restartNumberingAfterBreak="0">
+  <w:abstractNum w:abstractNumId="6" w15:restartNumberingAfterBreak="0">
+    <w:nsid w:val="67CA7DB1"/>
+    <w:multiLevelType w:val="hybridMultilevel"/>
+    <w:tmpl w:val="741E3AE6"/>
+    <w:lvl w:ilvl="0" w:tplc="18385FBC">
+      <w:start w:val="1"/>
+      <w:numFmt w:val="decimal"/>
+      <w:lvlText w:val="%1."/>
+      <w:lvlJc w:val="left"/>
+      <w:pPr>
+        <w:ind w:left="720" w:hanging="360"/>
+      </w:pPr>
+      <w:rPr>
+        <w:rFonts w:hint="default"/>
+        <w:b/>
+        <w:bCs/>
+      </w:rPr>
+    </w:lvl>
+    <w:lvl w:ilvl="1" w:tplc="40090019" w:tentative="1">
+      <w:start w:val="1"/>
+      <w:numFmt w:val="lowerLetter"/>
+      <w:lvlText w:val="%2."/>
+      <w:lvlJc w:val="left"/>
+      <w:pPr>
+        <w:ind w:left="1440" w:hanging="360"/>
+      </w:pPr>
+    </w:lvl>
+    <w:lvl w:ilvl="2" w:tplc="4009001B" w:tentative="1">
+      <w:start w:val="1"/>
+      <w:numFmt w:val="lowerRoman"/>
+      <w:lvlText w:val="%3."/>
+      <w:lvlJc w:val="right"/>
+      <w:pPr>
+        <w:ind w:left="2160" w:hanging="180"/>
+      </w:pPr>
+    </w:lvl>
+    <w:lvl w:ilvl="3" w:tplc="4009000F" w:tentative="1">
+      <w:start w:val="1"/>
+      <w:numFmt w:val="decimal"/>
+      <w:lvlText w:val="%4."/>
+      <w:lvlJc w:val="left"/>
+      <w:pPr>
+        <w:ind w:left="2880" w:hanging="360"/>
+      </w:pPr>
+    </w:lvl>
+    <w:lvl w:ilvl="4" w:tplc="40090019" w:tentative="1">
+      <w:start w:val="1"/>
+      <w:numFmt w:val="lowerLetter"/>
+      <w:lvlText w:val="%5."/>
+      <w:lvlJc w:val="left"/>
+      <w:pPr>
+        <w:ind w:left="3600" w:hanging="360"/>
+      </w:pPr>
+    </w:lvl>
+    <w:lvl w:ilvl="5" w:tplc="4009001B" w:tentative="1">
+      <w:start w:val="1"/>
+      <w:numFmt w:val="lowerRoman"/>
+      <w:lvlText w:val="%6."/>
+      <w:lvlJc w:val="right"/>
+      <w:pPr>
+        <w:ind w:left="4320" w:hanging="180"/>
+      </w:pPr>
+    </w:lvl>
+    <w:lvl w:ilvl="6" w:tplc="4009000F" w:tentative="1">
+      <w:start w:val="1"/>
+      <w:numFmt w:val="decimal"/>
+      <w:lvlText w:val="%7."/>
+      <w:lvlJc w:val="left"/>
+      <w:pPr>
+        <w:ind w:left="5040" w:hanging="360"/>
+      </w:pPr>
+    </w:lvl>
+    <w:lvl w:ilvl="7" w:tplc="40090019" w:tentative="1">
+      <w:start w:val="1"/>
+      <w:numFmt w:val="lowerLetter"/>
+      <w:lvlText w:val="%8."/>
+      <w:lvlJc w:val="left"/>
+      <w:pPr>
+        <w:ind w:left="5760" w:hanging="360"/>
+      </w:pPr>
+    </w:lvl>
+    <w:lvl w:ilvl="8" w:tplc="4009001B" w:tentative="1">
+      <w:start w:val="1"/>
+      <w:numFmt w:val="lowerRoman"/>
+      <w:lvlText w:val="%9."/>
+      <w:lvlJc w:val="right"/>
+      <w:pPr>
+        <w:ind w:left="6480" w:hanging="180"/>
+      </w:pPr>
+    </w:lvl>
+  </w:abstractNum>
+  <w:abstractNum w:abstractNumId="7" w15:restartNumberingAfterBreak="0">
     <w:nsid w:val="6D73217A"/>
     <w:multiLevelType w:val="hybridMultilevel"/>
     <w:tmpl w:val="8020E260"/>
@@ -865,19 +5021,28 @@
     </w:lvl>
   </w:abstractNum>
   <w:num w:numId="1" w16cid:durableId="375351942">
+    <w:abstractNumId w:val="2"/>
+  </w:num>
+  <w:num w:numId="2" w16cid:durableId="1400010736">
+    <w:abstractNumId w:val="4"/>
+  </w:num>
+  <w:num w:numId="3" w16cid:durableId="161548983">
     <w:abstractNumId w:val="1"/>
   </w:num>
-  <w:num w:numId="2" w16cid:durableId="1400010736">
-    <w:abstractNumId w:val="2"/>
+  <w:num w:numId="4" w16cid:durableId="536167477">
+    <w:abstractNumId w:val="5"/>
   </w:num>
-  <w:num w:numId="3" w16cid:durableId="161548983">
+  <w:num w:numId="5" w16cid:durableId="873929267">
+    <w:abstractNumId w:val="7"/>
+  </w:num>
+  <w:num w:numId="6" w16cid:durableId="649406454">
     <w:abstractNumId w:val="0"/>
   </w:num>
-  <w:num w:numId="4" w16cid:durableId="536167477">
+  <w:num w:numId="7" w16cid:durableId="946737658">
+    <w:abstractNumId w:val="6"/>
+  </w:num>
+  <w:num w:numId="8" w16cid:durableId="1304696346">
     <w:abstractNumId w:val="3"/>
-  </w:num>
-  <w:num w:numId="5" w16cid:durableId="873929267">
-    <w:abstractNumId w:val="4"/>
   </w:num>
 </w:numbering>
 </file>
@@ -1486,7 +5651,6 @@
   <w:style w:type="character" w:default="1" w:styleId="DefaultParagraphFont">
     <w:name w:val="Default Paragraph Font"/>
     <w:uiPriority w:val="1"/>
-    <w:semiHidden/>
     <w:unhideWhenUsed/>
   </w:style>
   <w:style w:type="table" w:default="1" w:styleId="TableNormal">

</xml_diff>